<commit_message>
added claude discussion to mvp doc
</commit_message>
<xml_diff>
--- a/Hakhel MVP tasks.docx
+++ b/Hakhel MVP tasks.docx
@@ -5,8 +5,21 @@
     <w:p>
       <w:pPr>
         <w:pStyle w:val="Title"/>
-      </w:pPr>
-      <w:r>
+        <w:rPr>
+          <w:rFonts w:asciiTheme="majorBidi" w:hAnsiTheme="majorBidi"/>
+        </w:rPr>
+      </w:pPr>
+      <w:r>
+        <w:rPr>
+          <w:rFonts w:asciiTheme="majorBidi" w:hAnsiTheme="majorBidi"/>
+          <w:lang w:bidi="he-IL"/>
+        </w:rPr>
+        <w:t xml:space="preserve">  </w:t>
+      </w:r>
+      <w:r>
+        <w:rPr>
+          <w:rFonts w:asciiTheme="majorBidi" w:hAnsiTheme="majorBidi"/>
+        </w:rPr>
         <w:t>Hakhel MVP tasks</w:t>
       </w:r>
     </w:p>
@@ -17,6 +30,9 @@
           <w:ilvl w:val="0"/>
           <w:numId w:val="4"/>
         </w:numPr>
+        <w:rPr>
+          <w:rFonts w:asciiTheme="majorBidi" w:hAnsiTheme="majorBidi" w:cstheme="majorBidi"/>
+        </w:rPr>
       </w:pPr>
     </w:p>
     <w:p>
@@ -26,9 +42,13 @@
           <w:ilvl w:val="0"/>
           <w:numId w:val="4"/>
         </w:numPr>
-      </w:pPr>
-      <w:r>
-        <w:rPr>
+        <w:rPr>
+          <w:rFonts w:asciiTheme="majorBidi" w:hAnsiTheme="majorBidi" w:cstheme="majorBidi"/>
+        </w:rPr>
+      </w:pPr>
+      <w:r>
+        <w:rPr>
+          <w:rFonts w:asciiTheme="majorBidi" w:hAnsiTheme="majorBidi" w:cstheme="majorBidi"/>
           <w:lang w:bidi="he-IL"/>
         </w:rPr>
         <w:t>Testing of message lifecycle and scheduling</w:t>
@@ -41,6 +61,9 @@
           <w:ilvl w:val="0"/>
           <w:numId w:val="4"/>
         </w:numPr>
+        <w:rPr>
+          <w:rFonts w:asciiTheme="majorBidi" w:hAnsiTheme="majorBidi" w:cstheme="majorBidi"/>
+        </w:rPr>
       </w:pPr>
     </w:p>
     <w:p>
@@ -50,13 +73,3592 @@
           <w:ilvl w:val="0"/>
           <w:numId w:val="4"/>
         </w:numPr>
-      </w:pPr>
-      <w:r>
-        <w:rPr>
+        <w:rPr>
+          <w:rFonts w:asciiTheme="majorBidi" w:hAnsiTheme="majorBidi" w:cstheme="majorBidi"/>
+        </w:rPr>
+      </w:pPr>
+      <w:r>
+        <w:rPr>
+          <w:rFonts w:asciiTheme="majorBidi" w:hAnsiTheme="majorBidi" w:cstheme="majorBidi"/>
           <w:lang w:bidi="he-IL"/>
         </w:rPr>
         <w:t>Approval of future messages by admin – review the need and logic</w:t>
       </w:r>
+    </w:p>
+    <w:p>
+      <w:pPr>
+        <w:rPr>
+          <w:rFonts w:asciiTheme="majorBidi" w:hAnsiTheme="majorBidi" w:cstheme="majorBidi"/>
+        </w:rPr>
+      </w:pPr>
+    </w:p>
+    <w:p>
+      <w:pPr>
+        <w:rPr>
+          <w:rFonts w:asciiTheme="majorBidi" w:hAnsiTheme="majorBidi" w:cstheme="majorBidi"/>
+        </w:rPr>
+      </w:pPr>
+      <w:r>
+        <w:rPr>
+          <w:rFonts w:asciiTheme="majorBidi" w:hAnsiTheme="majorBidi" w:cstheme="majorBidi"/>
+          <w:lang w:bidi="he-IL"/>
+        </w:rPr>
+        <w:t>Contact self-service</w:t>
+      </w:r>
+    </w:p>
+    <w:p>
+      <w:pPr>
+        <w:rPr>
+          <w:rFonts w:asciiTheme="majorBidi" w:hAnsiTheme="majorBidi" w:cstheme="majorBidi"/>
+        </w:rPr>
+      </w:pPr>
+      <w:r>
+        <w:rPr>
+          <w:rFonts w:asciiTheme="majorBidi" w:hAnsiTheme="majorBidi" w:cstheme="majorBidi"/>
+          <w:lang w:bidi="he-IL"/>
+        </w:rPr>
+        <w:t>When a contact receives sms message reminding him about an upcoming yahrzeit, the message will also contain a link that allows him to enter his own personal area in the Hakhel system to see/update his information and preferences and select more ways/venues to honor the yahrzeit. This involves:</w:t>
+      </w:r>
+    </w:p>
+    <w:p>
+      <w:pPr>
+        <w:pStyle w:val="ListParagraph"/>
+        <w:numPr>
+          <w:ilvl w:val="1"/>
+          <w:numId w:val="6"/>
+        </w:numPr>
+        <w:rPr>
+          <w:rFonts w:asciiTheme="majorBidi" w:hAnsiTheme="majorBidi" w:cstheme="majorBidi"/>
+        </w:rPr>
+      </w:pPr>
+      <w:r>
+        <w:rPr>
+          <w:rFonts w:asciiTheme="majorBidi" w:hAnsiTheme="majorBidi" w:cstheme="majorBidi"/>
+          <w:lang w:bidi="he-IL"/>
+        </w:rPr>
+        <w:t>Creating an invitation and a link to embedded in the sms, that allows access only to the contact’s area.</w:t>
+      </w:r>
+    </w:p>
+    <w:p>
+      <w:pPr>
+        <w:pStyle w:val="ListParagraph"/>
+        <w:numPr>
+          <w:ilvl w:val="1"/>
+          <w:numId w:val="6"/>
+        </w:numPr>
+        <w:rPr>
+          <w:rFonts w:asciiTheme="majorBidi" w:hAnsiTheme="majorBidi" w:cstheme="majorBidi"/>
+        </w:rPr>
+      </w:pPr>
+      <w:r>
+        <w:rPr>
+          <w:rFonts w:asciiTheme="majorBidi" w:hAnsiTheme="majorBidi" w:cstheme="majorBidi"/>
+          <w:lang w:bidi="he-IL"/>
+        </w:rPr>
+        <w:t>Creating a custom landing page with for the contact, that allows viewing/update his info, the deceased people that are related to him, preferences for each contact and each relation, and a list of other venues to honor the yahrzeit.</w:t>
+      </w:r>
+    </w:p>
+    <w:p>
+      <w:pPr>
+        <w:rPr>
+          <w:rFonts w:asciiTheme="majorBidi" w:hAnsiTheme="majorBidi" w:cstheme="majorBidi"/>
+        </w:rPr>
+      </w:pPr>
+    </w:p>
+    <w:p>
+      <w:pPr>
+        <w:rPr>
+          <w:rFonts w:asciiTheme="majorBidi" w:hAnsiTheme="majorBidi" w:cstheme="majorBidi"/>
+        </w:rPr>
+      </w:pPr>
+      <w:r>
+        <w:rPr>
+          <w:rFonts w:asciiTheme="majorBidi" w:hAnsiTheme="majorBidi" w:cstheme="majorBidi"/>
+        </w:rPr>
+        <w:t xml:space="preserve">----- </w:t>
+      </w:r>
+      <w:proofErr w:type="spellStart"/>
+      <w:r>
+        <w:rPr>
+          <w:rFonts w:asciiTheme="majorBidi" w:hAnsiTheme="majorBidi" w:cstheme="majorBidi"/>
+        </w:rPr>
+        <w:t>claude</w:t>
+      </w:r>
+      <w:proofErr w:type="spellEnd"/>
+      <w:r>
+        <w:rPr>
+          <w:rFonts w:asciiTheme="majorBidi" w:hAnsiTheme="majorBidi" w:cstheme="majorBidi"/>
+        </w:rPr>
+        <w:t>:</w:t>
+      </w:r>
+    </w:p>
+    <w:p>
+      <w:pPr>
+        <w:rPr>
+          <w:rFonts w:asciiTheme="majorBidi" w:hAnsiTheme="majorBidi" w:cstheme="majorBidi"/>
+        </w:rPr>
+      </w:pPr>
+      <w:r>
+        <w:rPr>
+          <w:rFonts w:asciiTheme="majorBidi" w:hAnsiTheme="majorBidi" w:cstheme="majorBidi"/>
+        </w:rPr>
+        <w:t>A few design questions:</w:t>
+      </w:r>
+    </w:p>
+    <w:p>
+      <w:pPr>
+        <w:rPr>
+          <w:rFonts w:asciiTheme="majorBidi" w:hAnsiTheme="majorBidi" w:cstheme="majorBidi"/>
+        </w:rPr>
+      </w:pPr>
+    </w:p>
+    <w:p>
+      <w:pPr>
+        <w:rPr>
+          <w:rFonts w:asciiTheme="majorBidi" w:hAnsiTheme="majorBidi" w:cstheme="majorBidi"/>
+        </w:rPr>
+      </w:pPr>
+      <w:r>
+        <w:rPr>
+          <w:rFonts w:asciiTheme="majorBidi" w:hAnsiTheme="majorBidi" w:cstheme="majorBidi"/>
+        </w:rPr>
+        <w:t xml:space="preserve">  1. Link/token strategy</w:t>
+      </w:r>
+    </w:p>
+    <w:p>
+      <w:pPr>
+        <w:rPr>
+          <w:rFonts w:asciiTheme="majorBidi" w:hAnsiTheme="majorBidi" w:cstheme="majorBidi"/>
+        </w:rPr>
+      </w:pPr>
+      <w:r>
+        <w:rPr>
+          <w:rFonts w:asciiTheme="majorBidi" w:hAnsiTheme="majorBidi" w:cstheme="majorBidi"/>
+        </w:rPr>
+        <w:t xml:space="preserve">  The </w:t>
+      </w:r>
+      <w:proofErr w:type="gramStart"/>
+      <w:r>
+        <w:rPr>
+          <w:rFonts w:asciiTheme="majorBidi" w:hAnsiTheme="majorBidi" w:cstheme="majorBidi"/>
+        </w:rPr>
+        <w:t>Hke::</w:t>
+      </w:r>
+      <w:proofErr w:type="gramEnd"/>
+      <w:r>
+        <w:rPr>
+          <w:rFonts w:asciiTheme="majorBidi" w:hAnsiTheme="majorBidi" w:cstheme="majorBidi"/>
+        </w:rPr>
+        <w:t>Relation model already has a token field. Since the SMS is sent per relation (one deceased person), the</w:t>
+      </w:r>
+    </w:p>
+    <w:p>
+      <w:pPr>
+        <w:rPr>
+          <w:rFonts w:asciiTheme="majorBidi" w:hAnsiTheme="majorBidi" w:cstheme="majorBidi"/>
+        </w:rPr>
+      </w:pPr>
+      <w:r>
+        <w:rPr>
+          <w:rFonts w:asciiTheme="majorBidi" w:hAnsiTheme="majorBidi" w:cstheme="majorBidi"/>
+        </w:rPr>
+        <w:t xml:space="preserve">  natural approach is a relation-scoped link. But the landing page could then show all of that contact's relations.</w:t>
+      </w:r>
+    </w:p>
+    <w:p>
+      <w:pPr>
+        <w:rPr>
+          <w:rFonts w:asciiTheme="majorBidi" w:hAnsiTheme="majorBidi" w:cstheme="majorBidi"/>
+        </w:rPr>
+      </w:pPr>
+      <w:r>
+        <w:rPr>
+          <w:rFonts w:asciiTheme="majorBidi" w:hAnsiTheme="majorBidi" w:cstheme="majorBidi"/>
+        </w:rPr>
+        <w:t xml:space="preserve">   Do you want:</w:t>
+      </w:r>
+    </w:p>
+    <w:p>
+      <w:pPr>
+        <w:rPr>
+          <w:rFonts w:asciiTheme="majorBidi" w:hAnsiTheme="majorBidi" w:cstheme="majorBidi"/>
+        </w:rPr>
+      </w:pPr>
+      <w:r>
+        <w:rPr>
+          <w:rFonts w:asciiTheme="majorBidi" w:hAnsiTheme="majorBidi" w:cstheme="majorBidi"/>
+        </w:rPr>
+        <w:t xml:space="preserve">  - A relation-scoped token (from the existing token field) — simple, already there</w:t>
+      </w:r>
+    </w:p>
+    <w:p>
+      <w:pPr>
+        <w:rPr>
+          <w:rFonts w:asciiTheme="majorBidi" w:hAnsiTheme="majorBidi" w:cstheme="majorBidi"/>
+        </w:rPr>
+      </w:pPr>
+      <w:r>
+        <w:rPr>
+          <w:rFonts w:asciiTheme="majorBidi" w:hAnsiTheme="majorBidi" w:cstheme="majorBidi"/>
+        </w:rPr>
+        <w:t xml:space="preserve">  - A contact-scoped token — requires a new token on </w:t>
+      </w:r>
+      <w:proofErr w:type="spellStart"/>
+      <w:r>
+        <w:rPr>
+          <w:rFonts w:asciiTheme="majorBidi" w:hAnsiTheme="majorBidi" w:cstheme="majorBidi"/>
+        </w:rPr>
+        <w:t>ContactPerson</w:t>
+      </w:r>
+      <w:proofErr w:type="spellEnd"/>
+      <w:r>
+        <w:rPr>
+          <w:rFonts w:asciiTheme="majorBidi" w:hAnsiTheme="majorBidi" w:cstheme="majorBidi"/>
+        </w:rPr>
+        <w:t>, gives access to all their relations from a</w:t>
+      </w:r>
+    </w:p>
+    <w:p>
+      <w:pPr>
+        <w:rPr>
+          <w:rFonts w:asciiTheme="majorBidi" w:hAnsiTheme="majorBidi" w:cstheme="majorBidi"/>
+        </w:rPr>
+      </w:pPr>
+      <w:r>
+        <w:rPr>
+          <w:rFonts w:asciiTheme="majorBidi" w:hAnsiTheme="majorBidi" w:cstheme="majorBidi"/>
+        </w:rPr>
+        <w:t xml:space="preserve">  single link regardless of which SMS triggered it</w:t>
+      </w:r>
+    </w:p>
+    <w:p>
+      <w:pPr>
+        <w:rPr>
+          <w:rFonts w:asciiTheme="majorBidi" w:hAnsiTheme="majorBidi" w:cstheme="majorBidi"/>
+        </w:rPr>
+      </w:pPr>
+    </w:p>
+    <w:p>
+      <w:pPr>
+        <w:rPr>
+          <w:rFonts w:asciiTheme="majorBidi" w:hAnsiTheme="majorBidi" w:cstheme="majorBidi"/>
+        </w:rPr>
+      </w:pPr>
+      <w:r>
+        <w:rPr>
+          <w:rFonts w:asciiTheme="majorBidi" w:hAnsiTheme="majorBidi" w:cstheme="majorBidi"/>
+        </w:rPr>
+        <w:t xml:space="preserve">  2. Link lifetime</w:t>
+      </w:r>
+    </w:p>
+    <w:p>
+      <w:pPr>
+        <w:rPr>
+          <w:rFonts w:asciiTheme="majorBidi" w:hAnsiTheme="majorBidi" w:cstheme="majorBidi"/>
+        </w:rPr>
+      </w:pPr>
+      <w:r>
+        <w:rPr>
+          <w:rFonts w:asciiTheme="majorBidi" w:hAnsiTheme="majorBidi" w:cstheme="majorBidi"/>
+        </w:rPr>
+        <w:t xml:space="preserve">  - Permanent personal link (contact can bookmark and return anytime)</w:t>
+      </w:r>
+    </w:p>
+    <w:p>
+      <w:pPr>
+        <w:rPr>
+          <w:rFonts w:asciiTheme="majorBidi" w:hAnsiTheme="majorBidi" w:cstheme="majorBidi"/>
+        </w:rPr>
+      </w:pPr>
+      <w:r>
+        <w:rPr>
+          <w:rFonts w:asciiTheme="majorBidi" w:hAnsiTheme="majorBidi" w:cstheme="majorBidi"/>
+        </w:rPr>
+        <w:t xml:space="preserve">  - Time-limited (expires after e.g. 30 days) — more secure but contact loses access</w:t>
+      </w:r>
+    </w:p>
+    <w:p>
+      <w:pPr>
+        <w:rPr>
+          <w:rFonts w:asciiTheme="majorBidi" w:hAnsiTheme="majorBidi" w:cstheme="majorBidi"/>
+        </w:rPr>
+      </w:pPr>
+    </w:p>
+    <w:p>
+      <w:pPr>
+        <w:rPr>
+          <w:rFonts w:asciiTheme="majorBidi" w:hAnsiTheme="majorBidi" w:cstheme="majorBidi"/>
+        </w:rPr>
+      </w:pPr>
+      <w:r>
+        <w:rPr>
+          <w:rFonts w:asciiTheme="majorBidi" w:hAnsiTheme="majorBidi" w:cstheme="majorBidi"/>
+        </w:rPr>
+        <w:t xml:space="preserve">  3. Scope of the landing page</w:t>
+      </w:r>
+    </w:p>
+    <w:p>
+      <w:pPr>
+        <w:rPr>
+          <w:rFonts w:asciiTheme="majorBidi" w:hAnsiTheme="majorBidi" w:cstheme="majorBidi"/>
+        </w:rPr>
+      </w:pPr>
+      <w:r>
+        <w:rPr>
+          <w:rFonts w:asciiTheme="majorBidi" w:hAnsiTheme="majorBidi" w:cstheme="majorBidi"/>
+        </w:rPr>
+        <w:t xml:space="preserve">  - Just the relation mentioned in the SMS (one deceased, one yahrzeit)?</w:t>
+      </w:r>
+    </w:p>
+    <w:p>
+      <w:pPr>
+        <w:rPr>
+          <w:rFonts w:asciiTheme="majorBidi" w:hAnsiTheme="majorBidi" w:cstheme="majorBidi"/>
+        </w:rPr>
+      </w:pPr>
+      <w:r>
+        <w:rPr>
+          <w:rFonts w:asciiTheme="majorBidi" w:hAnsiTheme="majorBidi" w:cstheme="majorBidi"/>
+        </w:rPr>
+        <w:t xml:space="preserve">  - Or all deceased people linked to this contact?</w:t>
+      </w:r>
+    </w:p>
+    <w:p>
+      <w:pPr>
+        <w:rPr>
+          <w:rFonts w:asciiTheme="majorBidi" w:hAnsiTheme="majorBidi" w:cstheme="majorBidi"/>
+        </w:rPr>
+      </w:pPr>
+    </w:p>
+    <w:p>
+      <w:pPr>
+        <w:rPr>
+          <w:rFonts w:asciiTheme="majorBidi" w:hAnsiTheme="majorBidi" w:cstheme="majorBidi"/>
+        </w:rPr>
+      </w:pPr>
+      <w:r>
+        <w:rPr>
+          <w:rFonts w:asciiTheme="majorBidi" w:hAnsiTheme="majorBidi" w:cstheme="majorBidi"/>
+        </w:rPr>
+        <w:t xml:space="preserve">  4. What can they actually do there?</w:t>
+      </w:r>
+    </w:p>
+    <w:p>
+      <w:pPr>
+        <w:rPr>
+          <w:rFonts w:asciiTheme="majorBidi" w:hAnsiTheme="majorBidi" w:cstheme="majorBidi"/>
+        </w:rPr>
+      </w:pPr>
+      <w:r>
+        <w:rPr>
+          <w:rFonts w:asciiTheme="majorBidi" w:hAnsiTheme="majorBidi" w:cstheme="majorBidi"/>
+        </w:rPr>
+        <w:t xml:space="preserve">  You listed: view/update info, preferences per contact/relation, other venues. A few specifics:</w:t>
+      </w:r>
+    </w:p>
+    <w:p>
+      <w:pPr>
+        <w:rPr>
+          <w:rFonts w:asciiTheme="majorBidi" w:hAnsiTheme="majorBidi" w:cstheme="majorBidi"/>
+        </w:rPr>
+      </w:pPr>
+      <w:r>
+        <w:rPr>
+          <w:rFonts w:asciiTheme="majorBidi" w:hAnsiTheme="majorBidi" w:cstheme="majorBidi"/>
+        </w:rPr>
+        <w:t xml:space="preserve">  - Can they change their phone/email? (Sensitive — could break delivery)</w:t>
+      </w:r>
+    </w:p>
+    <w:p>
+      <w:pPr>
+        <w:rPr>
+          <w:rFonts w:asciiTheme="majorBidi" w:hAnsiTheme="majorBidi" w:cstheme="majorBidi"/>
+        </w:rPr>
+      </w:pPr>
+      <w:r>
+        <w:rPr>
+          <w:rFonts w:asciiTheme="majorBidi" w:hAnsiTheme="majorBidi" w:cstheme="majorBidi"/>
+        </w:rPr>
+        <w:t xml:space="preserve">  - Can they opt out of messages entirely?</w:t>
+      </w:r>
+    </w:p>
+    <w:p>
+      <w:pPr>
+        <w:rPr>
+          <w:rFonts w:asciiTheme="majorBidi" w:hAnsiTheme="majorBidi" w:cstheme="majorBidi"/>
+        </w:rPr>
+      </w:pPr>
+      <w:r>
+        <w:rPr>
+          <w:rFonts w:asciiTheme="majorBidi" w:hAnsiTheme="majorBidi" w:cstheme="majorBidi"/>
+        </w:rPr>
+        <w:t xml:space="preserve">  - "Other venues" — are these community-defined links (donate, livestream, etc.)? Is this where </w:t>
+      </w:r>
+      <w:proofErr w:type="gramStart"/>
+      <w:r>
+        <w:rPr>
+          <w:rFonts w:asciiTheme="majorBidi" w:hAnsiTheme="majorBidi" w:cstheme="majorBidi"/>
+        </w:rPr>
+        <w:t>Hke::</w:t>
+      </w:r>
+      <w:proofErr w:type="spellStart"/>
+      <w:proofErr w:type="gramEnd"/>
+      <w:r>
+        <w:rPr>
+          <w:rFonts w:asciiTheme="majorBidi" w:hAnsiTheme="majorBidi" w:cstheme="majorBidi"/>
+        </w:rPr>
+        <w:t>LandingPage</w:t>
+      </w:r>
+      <w:proofErr w:type="spellEnd"/>
+    </w:p>
+    <w:p>
+      <w:pPr>
+        <w:rPr>
+          <w:rFonts w:asciiTheme="majorBidi" w:hAnsiTheme="majorBidi" w:cstheme="majorBidi"/>
+        </w:rPr>
+      </w:pPr>
+      <w:r>
+        <w:rPr>
+          <w:rFonts w:asciiTheme="majorBidi" w:hAnsiTheme="majorBidi" w:cstheme="majorBidi"/>
+        </w:rPr>
+        <w:t xml:space="preserve">  comes in?</w:t>
+      </w:r>
+    </w:p>
+    <w:p>
+      <w:pPr>
+        <w:rPr>
+          <w:rFonts w:asciiTheme="majorBidi" w:hAnsiTheme="majorBidi" w:cstheme="majorBidi"/>
+        </w:rPr>
+      </w:pPr>
+    </w:p>
+    <w:p>
+      <w:pPr>
+        <w:rPr>
+          <w:rFonts w:asciiTheme="majorBidi" w:hAnsiTheme="majorBidi" w:cstheme="majorBidi"/>
+        </w:rPr>
+      </w:pPr>
+      <w:r>
+        <w:rPr>
+          <w:rFonts w:asciiTheme="majorBidi" w:hAnsiTheme="majorBidi" w:cstheme="majorBidi"/>
+        </w:rPr>
+        <w:t xml:space="preserve">  5. Authentication model</w:t>
+      </w:r>
+    </w:p>
+    <w:p>
+      <w:pPr>
+        <w:rPr>
+          <w:rFonts w:asciiTheme="majorBidi" w:hAnsiTheme="majorBidi" w:cstheme="majorBidi"/>
+        </w:rPr>
+      </w:pPr>
+      <w:r>
+        <w:rPr>
+          <w:rFonts w:asciiTheme="majorBidi" w:hAnsiTheme="majorBidi" w:cstheme="majorBidi"/>
+        </w:rPr>
+        <w:t xml:space="preserve">  Contacts are not User records. This self-service area would be completely outside Devise — pure token-based</w:t>
+      </w:r>
+    </w:p>
+    <w:p>
+      <w:pPr>
+        <w:rPr>
+          <w:rFonts w:asciiTheme="majorBidi" w:hAnsiTheme="majorBidi" w:cstheme="majorBidi"/>
+        </w:rPr>
+      </w:pPr>
+      <w:r>
+        <w:rPr>
+          <w:rFonts w:asciiTheme="majorBidi" w:hAnsiTheme="majorBidi" w:cstheme="majorBidi"/>
+        </w:rPr>
+        <w:t xml:space="preserve">  access. Comfortable with that?</w:t>
+      </w:r>
+    </w:p>
+    <w:p>
+      <w:pPr>
+        <w:rPr>
+          <w:rFonts w:asciiTheme="majorBidi" w:hAnsiTheme="majorBidi" w:cstheme="majorBidi"/>
+        </w:rPr>
+      </w:pPr>
+    </w:p>
+    <w:p>
+      <w:pPr>
+        <w:rPr>
+          <w:rFonts w:asciiTheme="majorBidi" w:hAnsiTheme="majorBidi" w:cstheme="majorBidi"/>
+        </w:rPr>
+      </w:pPr>
+      <w:r>
+        <w:rPr>
+          <w:rFonts w:asciiTheme="majorBidi" w:hAnsiTheme="majorBidi" w:cstheme="majorBidi"/>
+        </w:rPr>
+        <w:t xml:space="preserve">  What are your thoughts on these?</w:t>
+      </w:r>
+    </w:p>
+    <w:p>
+      <w:pPr>
+        <w:rPr>
+          <w:rFonts w:asciiTheme="majorBidi" w:hAnsiTheme="majorBidi" w:cstheme="majorBidi"/>
+        </w:rPr>
+      </w:pPr>
+    </w:p>
+    <w:p>
+      <w:pPr>
+        <w:rPr>
+          <w:rFonts w:asciiTheme="majorBidi" w:hAnsiTheme="majorBidi" w:cstheme="majorBidi"/>
+        </w:rPr>
+      </w:pPr>
+      <w:r>
+        <w:rPr>
+          <w:rFonts w:asciiTheme="majorBidi" w:hAnsiTheme="majorBidi" w:cstheme="majorBidi"/>
+        </w:rPr>
+        <w:t>---- me:</w:t>
+      </w:r>
+    </w:p>
+    <w:p>
+      <w:pPr>
+        <w:pStyle w:val="ListParagraph"/>
+        <w:numPr>
+          <w:ilvl w:val="0"/>
+          <w:numId w:val="7"/>
+        </w:numPr>
+        <w:rPr>
+          <w:rFonts w:asciiTheme="majorBidi" w:hAnsiTheme="majorBidi" w:cstheme="majorBidi"/>
+        </w:rPr>
+      </w:pPr>
+      <w:r>
+        <w:rPr>
+          <w:rFonts w:asciiTheme="majorBidi" w:hAnsiTheme="majorBidi" w:cstheme="majorBidi"/>
+        </w:rPr>
+        <w:lastRenderedPageBreak/>
+        <w:t>Contact level token – this is cleaner. However, would like to know from which message/sms/email the user first accessed the system (is this useful?)</w:t>
+      </w:r>
+    </w:p>
+    <w:p>
+      <w:pPr>
+        <w:pStyle w:val="ListParagraph"/>
+        <w:numPr>
+          <w:ilvl w:val="0"/>
+          <w:numId w:val="7"/>
+        </w:numPr>
+        <w:rPr>
+          <w:rFonts w:asciiTheme="majorBidi" w:hAnsiTheme="majorBidi" w:cstheme="majorBidi"/>
+        </w:rPr>
+      </w:pPr>
+      <w:r>
+        <w:rPr>
+          <w:rFonts w:asciiTheme="majorBidi" w:hAnsiTheme="majorBidi" w:cstheme="majorBidi"/>
+        </w:rPr>
+        <w:t>Permanent</w:t>
+      </w:r>
+    </w:p>
+    <w:p>
+      <w:pPr>
+        <w:pStyle w:val="ListParagraph"/>
+        <w:numPr>
+          <w:ilvl w:val="0"/>
+          <w:numId w:val="7"/>
+        </w:numPr>
+        <w:rPr>
+          <w:rFonts w:asciiTheme="majorBidi" w:hAnsiTheme="majorBidi" w:cstheme="majorBidi"/>
+        </w:rPr>
+      </w:pPr>
+      <w:r>
+        <w:rPr>
+          <w:rFonts w:asciiTheme="majorBidi" w:hAnsiTheme="majorBidi" w:cstheme="majorBidi"/>
+        </w:rPr>
+        <w:t>All deceased people related to contact, all messages (future and sent) to contact, and his preferences</w:t>
+      </w:r>
+    </w:p>
+    <w:p>
+      <w:pPr>
+        <w:pStyle w:val="ListParagraph"/>
+        <w:numPr>
+          <w:ilvl w:val="0"/>
+          <w:numId w:val="7"/>
+        </w:numPr>
+        <w:rPr>
+          <w:rFonts w:asciiTheme="majorBidi" w:hAnsiTheme="majorBidi" w:cstheme="majorBidi"/>
+        </w:rPr>
+      </w:pPr>
+      <w:r>
+        <w:rPr>
+          <w:rFonts w:asciiTheme="majorBidi" w:hAnsiTheme="majorBidi" w:cstheme="majorBidi"/>
+        </w:rPr>
+        <w:t>They can change email/phone number.</w:t>
+      </w:r>
+      <w:r>
+        <w:rPr>
+          <w:rFonts w:asciiTheme="majorBidi" w:hAnsiTheme="majorBidi" w:cstheme="majorBidi"/>
+        </w:rPr>
+        <w:t xml:space="preserve"> If they do, Hakhel should rebuild future messages (same as when they change some preferences, which we should discuss what they are at this level). They can opt out, and they can opt out selectively – per relation. Regarding “Other Venues” this is where the landing page comes in. It will suggest :</w:t>
+      </w:r>
+    </w:p>
+    <w:p>
+      <w:pPr>
+        <w:pStyle w:val="ListParagraph"/>
+        <w:numPr>
+          <w:ilvl w:val="1"/>
+          <w:numId w:val="7"/>
+        </w:numPr>
+        <w:rPr>
+          <w:rFonts w:asciiTheme="majorBidi" w:hAnsiTheme="majorBidi" w:cstheme="majorBidi"/>
+        </w:rPr>
+      </w:pPr>
+      <w:r>
+        <w:rPr>
+          <w:rFonts w:asciiTheme="majorBidi" w:hAnsiTheme="majorBidi" w:cstheme="majorBidi"/>
+        </w:rPr>
+        <w:t>Kadish prayer to be done in the synagogue if the contact can’t come</w:t>
+      </w:r>
+    </w:p>
+    <w:p>
+      <w:pPr>
+        <w:pStyle w:val="ListParagraph"/>
+        <w:numPr>
+          <w:ilvl w:val="1"/>
+          <w:numId w:val="7"/>
+        </w:numPr>
+        <w:rPr>
+          <w:rFonts w:asciiTheme="majorBidi" w:hAnsiTheme="majorBidi" w:cstheme="majorBidi"/>
+        </w:rPr>
+      </w:pPr>
+      <w:r>
+        <w:rPr>
+          <w:rFonts w:asciiTheme="majorBidi" w:hAnsiTheme="majorBidi" w:cstheme="majorBidi"/>
+        </w:rPr>
+        <w:t>A “</w:t>
+      </w:r>
+      <w:r>
+        <w:rPr>
+          <w:rFonts w:asciiTheme="majorBidi" w:hAnsiTheme="majorBidi" w:cstheme="majorBidi" w:hint="cs"/>
+          <w:rtl/>
+          <w:lang w:bidi="he-IL"/>
+        </w:rPr>
+        <w:t>סעודת מצווה</w:t>
+      </w:r>
+      <w:r>
+        <w:rPr>
+          <w:rFonts w:asciiTheme="majorBidi" w:hAnsiTheme="majorBidi" w:cstheme="majorBidi"/>
+        </w:rPr>
+        <w:t>” – special meal at the synagogue to honor the yahrzeit this can be on the yahrzeit day or week, or in the following Shabat</w:t>
+      </w:r>
+    </w:p>
+    <w:p>
+      <w:pPr>
+        <w:pStyle w:val="ListParagraph"/>
+        <w:numPr>
+          <w:ilvl w:val="1"/>
+          <w:numId w:val="7"/>
+        </w:numPr>
+        <w:rPr>
+          <w:rFonts w:asciiTheme="majorBidi" w:hAnsiTheme="majorBidi" w:cstheme="majorBidi"/>
+        </w:rPr>
+      </w:pPr>
+      <w:r>
+        <w:rPr>
+          <w:rFonts w:asciiTheme="majorBidi" w:hAnsiTheme="majorBidi" w:cstheme="majorBidi"/>
+        </w:rPr>
+        <w:t>Other services, depending on the specific community and what it can offer.</w:t>
+      </w:r>
+    </w:p>
+    <w:p>
+      <w:pPr>
+        <w:pStyle w:val="ListParagraph"/>
+        <w:numPr>
+          <w:ilvl w:val="0"/>
+          <w:numId w:val="7"/>
+        </w:numPr>
+        <w:rPr>
+          <w:rFonts w:asciiTheme="majorBidi" w:hAnsiTheme="majorBidi" w:cstheme="majorBidi"/>
+        </w:rPr>
+      </w:pPr>
+      <w:r>
+        <w:rPr>
+          <w:rFonts w:asciiTheme="majorBidi" w:hAnsiTheme="majorBidi" w:cstheme="majorBidi"/>
+        </w:rPr>
+        <w:t>Yes, I understand in this case they are not proper users. Should they be? Should we let them access the system for 30 days and then require them to create a proper user id</w:t>
+      </w:r>
+    </w:p>
+    <w:p>
+      <w:pPr>
+        <w:rPr>
+          <w:rFonts w:asciiTheme="majorBidi" w:hAnsiTheme="majorBidi" w:cstheme="majorBidi"/>
+        </w:rPr>
+      </w:pPr>
+      <w:r>
+        <w:rPr>
+          <w:rFonts w:asciiTheme="majorBidi" w:hAnsiTheme="majorBidi" w:cstheme="majorBidi"/>
+        </w:rPr>
+        <w:t xml:space="preserve">----- </w:t>
+      </w:r>
+      <w:proofErr w:type="spellStart"/>
+      <w:r>
+        <w:rPr>
+          <w:rFonts w:asciiTheme="majorBidi" w:hAnsiTheme="majorBidi" w:cstheme="majorBidi"/>
+        </w:rPr>
+        <w:t>claude</w:t>
+      </w:r>
+      <w:proofErr w:type="spellEnd"/>
+      <w:r>
+        <w:rPr>
+          <w:rFonts w:asciiTheme="majorBidi" w:hAnsiTheme="majorBidi" w:cstheme="majorBidi"/>
+        </w:rPr>
+        <w:t>:</w:t>
+      </w:r>
+      <w:r>
+        <w:rPr>
+          <w:rFonts w:asciiTheme="majorBidi" w:hAnsiTheme="majorBidi" w:cstheme="majorBidi"/>
+        </w:rPr>
+        <w:br/>
+      </w:r>
+      <w:r>
+        <w:rPr>
+          <w:rFonts w:ascii="Apple Color Emoji" w:hAnsi="Apple Color Emoji" w:cs="Apple Color Emoji"/>
+        </w:rPr>
+        <w:t>⏺</w:t>
+      </w:r>
+      <w:r>
+        <w:rPr>
+          <w:rFonts w:asciiTheme="majorBidi" w:hAnsiTheme="majorBidi" w:cstheme="majorBidi"/>
+        </w:rPr>
+        <w:t xml:space="preserve"> Great answers. Let me share my thinking on each, then raise the questions that still need decisions.</w:t>
+      </w:r>
+    </w:p>
+    <w:p>
+      <w:pPr>
+        <w:rPr>
+          <w:rFonts w:asciiTheme="majorBidi" w:hAnsiTheme="majorBidi" w:cstheme="majorBidi"/>
+        </w:rPr>
+      </w:pPr>
+    </w:p>
+    <w:p>
+      <w:pPr>
+        <w:rPr>
+          <w:rFonts w:asciiTheme="majorBidi" w:hAnsiTheme="majorBidi" w:cstheme="majorBidi"/>
+        </w:rPr>
+      </w:pPr>
+      <w:r>
+        <w:rPr>
+          <w:rFonts w:asciiTheme="majorBidi" w:hAnsiTheme="majorBidi" w:cstheme="majorBidi"/>
+        </w:rPr>
+        <w:t xml:space="preserve">  ---</w:t>
+      </w:r>
+    </w:p>
+    <w:p>
+      <w:pPr>
+        <w:rPr>
+          <w:rFonts w:asciiTheme="majorBidi" w:hAnsiTheme="majorBidi" w:cstheme="majorBidi"/>
+        </w:rPr>
+      </w:pPr>
+      <w:r>
+        <w:rPr>
+          <w:rFonts w:asciiTheme="majorBidi" w:hAnsiTheme="majorBidi" w:cstheme="majorBidi"/>
+        </w:rPr>
+        <w:t xml:space="preserve">  1. Tracking first-access source — yes, worth it</w:t>
+      </w:r>
+    </w:p>
+    <w:p>
+      <w:pPr>
+        <w:rPr>
+          <w:rFonts w:asciiTheme="majorBidi" w:hAnsiTheme="majorBidi" w:cstheme="majorBidi"/>
+        </w:rPr>
+      </w:pPr>
+      <w:r>
+        <w:rPr>
+          <w:rFonts w:asciiTheme="majorBidi" w:hAnsiTheme="majorBidi" w:cstheme="majorBidi"/>
+        </w:rPr>
+        <w:t xml:space="preserve">  Simple approach: every SMS link includes the </w:t>
+      </w:r>
+      <w:proofErr w:type="spellStart"/>
+      <w:r>
+        <w:rPr>
+          <w:rFonts w:asciiTheme="majorBidi" w:hAnsiTheme="majorBidi" w:cstheme="majorBidi"/>
+        </w:rPr>
+        <w:t>FutureMessage</w:t>
+      </w:r>
+      <w:proofErr w:type="spellEnd"/>
+      <w:r>
+        <w:rPr>
+          <w:rFonts w:asciiTheme="majorBidi" w:hAnsiTheme="majorBidi" w:cstheme="majorBidi"/>
+        </w:rPr>
+        <w:t xml:space="preserve"> token as a query param (e.g. ?via=abc123). When the</w:t>
+      </w:r>
+    </w:p>
+    <w:p>
+      <w:pPr>
+        <w:rPr>
+          <w:rFonts w:asciiTheme="majorBidi" w:hAnsiTheme="majorBidi" w:cstheme="majorBidi"/>
+        </w:rPr>
+      </w:pPr>
+      <w:r>
+        <w:rPr>
+          <w:rFonts w:asciiTheme="majorBidi" w:hAnsiTheme="majorBidi" w:cstheme="majorBidi"/>
+        </w:rPr>
+        <w:t xml:space="preserve">  contact first lands, we log that token to their record (</w:t>
+      </w:r>
+      <w:proofErr w:type="spellStart"/>
+      <w:r>
+        <w:rPr>
+          <w:rFonts w:asciiTheme="majorBidi" w:hAnsiTheme="majorBidi" w:cstheme="majorBidi"/>
+        </w:rPr>
+        <w:t>ContactPerson.first_access_via_token</w:t>
+      </w:r>
+      <w:proofErr w:type="spellEnd"/>
+      <w:r>
+        <w:rPr>
+          <w:rFonts w:asciiTheme="majorBidi" w:hAnsiTheme="majorBidi" w:cstheme="majorBidi"/>
+        </w:rPr>
+        <w:t>). Costs almost</w:t>
+      </w:r>
+    </w:p>
+    <w:p>
+      <w:pPr>
+        <w:rPr>
+          <w:rFonts w:asciiTheme="majorBidi" w:hAnsiTheme="majorBidi" w:cstheme="majorBidi"/>
+        </w:rPr>
+      </w:pPr>
+      <w:r>
+        <w:rPr>
+          <w:rFonts w:asciiTheme="majorBidi" w:hAnsiTheme="majorBidi" w:cstheme="majorBidi"/>
+        </w:rPr>
+        <w:t xml:space="preserve">  nothing and gives you useful data — which message converted them, how quickly they responded.</w:t>
+      </w:r>
+    </w:p>
+    <w:p>
+      <w:pPr>
+        <w:rPr>
+          <w:rFonts w:asciiTheme="majorBidi" w:hAnsiTheme="majorBidi" w:cstheme="majorBidi"/>
+        </w:rPr>
+      </w:pPr>
+    </w:p>
+    <w:p>
+      <w:pPr>
+        <w:rPr>
+          <w:rFonts w:asciiTheme="majorBidi" w:hAnsiTheme="majorBidi" w:cstheme="majorBidi"/>
+        </w:rPr>
+      </w:pPr>
+      <w:r>
+        <w:rPr>
+          <w:rFonts w:asciiTheme="majorBidi" w:hAnsiTheme="majorBidi" w:cstheme="majorBidi"/>
+        </w:rPr>
+        <w:t xml:space="preserve">  ---</w:t>
+      </w:r>
+    </w:p>
+    <w:p>
+      <w:pPr>
+        <w:rPr>
+          <w:rFonts w:asciiTheme="majorBidi" w:hAnsiTheme="majorBidi" w:cstheme="majorBidi"/>
+        </w:rPr>
+      </w:pPr>
+      <w:r>
+        <w:rPr>
+          <w:rFonts w:asciiTheme="majorBidi" w:hAnsiTheme="majorBidi" w:cstheme="majorBidi"/>
+        </w:rPr>
+        <w:t xml:space="preserve">  2 &amp; 3. Token on </w:t>
+      </w:r>
+      <w:proofErr w:type="spellStart"/>
+      <w:r>
+        <w:rPr>
+          <w:rFonts w:asciiTheme="majorBidi" w:hAnsiTheme="majorBidi" w:cstheme="majorBidi"/>
+        </w:rPr>
+        <w:t>ContactPerson</w:t>
+      </w:r>
+      <w:proofErr w:type="spellEnd"/>
+      <w:r>
+        <w:rPr>
+          <w:rFonts w:asciiTheme="majorBidi" w:hAnsiTheme="majorBidi" w:cstheme="majorBidi"/>
+        </w:rPr>
+        <w:t>, permanent, full scope</w:t>
+      </w:r>
+    </w:p>
+    <w:p>
+      <w:pPr>
+        <w:rPr>
+          <w:rFonts w:asciiTheme="majorBidi" w:hAnsiTheme="majorBidi" w:cstheme="majorBidi"/>
+        </w:rPr>
+      </w:pPr>
+      <w:r>
+        <w:rPr>
+          <w:rFonts w:asciiTheme="majorBidi" w:hAnsiTheme="majorBidi" w:cstheme="majorBidi"/>
+        </w:rPr>
+        <w:t xml:space="preserve">  Add a token column to </w:t>
+      </w:r>
+      <w:proofErr w:type="spellStart"/>
+      <w:r>
+        <w:rPr>
+          <w:rFonts w:asciiTheme="majorBidi" w:hAnsiTheme="majorBidi" w:cstheme="majorBidi"/>
+        </w:rPr>
+        <w:t>hke_contact_people</w:t>
+      </w:r>
+      <w:proofErr w:type="spellEnd"/>
+      <w:r>
+        <w:rPr>
+          <w:rFonts w:asciiTheme="majorBidi" w:hAnsiTheme="majorBidi" w:cstheme="majorBidi"/>
+        </w:rPr>
+        <w:t>. The link in every SMS points to /</w:t>
+      </w:r>
+      <w:proofErr w:type="spellStart"/>
+      <w:r>
+        <w:rPr>
+          <w:rFonts w:asciiTheme="majorBidi" w:hAnsiTheme="majorBidi" w:cstheme="majorBidi"/>
+        </w:rPr>
+        <w:t>hke</w:t>
+      </w:r>
+      <w:proofErr w:type="spellEnd"/>
+      <w:r>
+        <w:rPr>
+          <w:rFonts w:asciiTheme="majorBidi" w:hAnsiTheme="majorBidi" w:cstheme="majorBidi"/>
+        </w:rPr>
+        <w:t>/contact/:token. The page shows</w:t>
+      </w:r>
+    </w:p>
+    <w:p>
+      <w:pPr>
+        <w:rPr>
+          <w:rFonts w:asciiTheme="majorBidi" w:hAnsiTheme="majorBidi" w:cstheme="majorBidi"/>
+        </w:rPr>
+      </w:pPr>
+      <w:r>
+        <w:rPr>
+          <w:rFonts w:asciiTheme="majorBidi" w:hAnsiTheme="majorBidi" w:cstheme="majorBidi"/>
+        </w:rPr>
+        <w:t xml:space="preserve">  everything related to that contact. Clean.</w:t>
+      </w:r>
+    </w:p>
+    <w:p>
+      <w:pPr>
+        <w:rPr>
+          <w:rFonts w:asciiTheme="majorBidi" w:hAnsiTheme="majorBidi" w:cstheme="majorBidi"/>
+        </w:rPr>
+      </w:pPr>
+    </w:p>
+    <w:p>
+      <w:pPr>
+        <w:rPr>
+          <w:rFonts w:asciiTheme="majorBidi" w:hAnsiTheme="majorBidi" w:cstheme="majorBidi"/>
+        </w:rPr>
+      </w:pPr>
+      <w:r>
+        <w:rPr>
+          <w:rFonts w:asciiTheme="majorBidi" w:hAnsiTheme="majorBidi" w:cstheme="majorBidi"/>
+        </w:rPr>
+        <w:t xml:space="preserve">  ---</w:t>
+      </w:r>
+    </w:p>
+    <w:p>
+      <w:pPr>
+        <w:rPr>
+          <w:rFonts w:asciiTheme="majorBidi" w:hAnsiTheme="majorBidi" w:cstheme="majorBidi"/>
+        </w:rPr>
+      </w:pPr>
+      <w:r>
+        <w:rPr>
+          <w:rFonts w:asciiTheme="majorBidi" w:hAnsiTheme="majorBidi" w:cstheme="majorBidi"/>
+        </w:rPr>
+        <w:t xml:space="preserve">  4. Opt-out design</w:t>
+      </w:r>
+    </w:p>
+    <w:p>
+      <w:pPr>
+        <w:rPr>
+          <w:rFonts w:asciiTheme="majorBidi" w:hAnsiTheme="majorBidi" w:cstheme="majorBidi"/>
+        </w:rPr>
+      </w:pPr>
+      <w:r>
+        <w:rPr>
+          <w:rFonts w:asciiTheme="majorBidi" w:hAnsiTheme="majorBidi" w:cstheme="majorBidi"/>
+        </w:rPr>
+        <w:t xml:space="preserve">  Two levels you described map naturally to the existing Preference model:</w:t>
+      </w:r>
+    </w:p>
+    <w:p>
+      <w:pPr>
+        <w:rPr>
+          <w:rFonts w:asciiTheme="majorBidi" w:hAnsiTheme="majorBidi" w:cstheme="majorBidi"/>
+        </w:rPr>
+      </w:pPr>
+      <w:r>
+        <w:rPr>
+          <w:rFonts w:asciiTheme="majorBidi" w:hAnsiTheme="majorBidi" w:cstheme="majorBidi"/>
+        </w:rPr>
+        <w:t xml:space="preserve">  - Global opt-out: store on </w:t>
+      </w:r>
+      <w:proofErr w:type="spellStart"/>
+      <w:r>
+        <w:rPr>
+          <w:rFonts w:asciiTheme="majorBidi" w:hAnsiTheme="majorBidi" w:cstheme="majorBidi"/>
+        </w:rPr>
+        <w:t>ContactPerson's</w:t>
+      </w:r>
+      <w:proofErr w:type="spellEnd"/>
+      <w:r>
+        <w:rPr>
+          <w:rFonts w:asciiTheme="majorBidi" w:hAnsiTheme="majorBidi" w:cstheme="majorBidi"/>
+        </w:rPr>
+        <w:t xml:space="preserve"> Preference — </w:t>
+      </w:r>
+      <w:proofErr w:type="spellStart"/>
+      <w:r>
+        <w:rPr>
+          <w:rFonts w:asciiTheme="majorBidi" w:hAnsiTheme="majorBidi" w:cstheme="majorBidi"/>
+        </w:rPr>
+        <w:t>delivery_priority</w:t>
+      </w:r>
+      <w:proofErr w:type="spellEnd"/>
+      <w:r>
+        <w:rPr>
+          <w:rFonts w:asciiTheme="majorBidi" w:hAnsiTheme="majorBidi" w:cstheme="majorBidi"/>
+        </w:rPr>
+        <w:t xml:space="preserve">: [] or a dedicated </w:t>
+      </w:r>
+      <w:proofErr w:type="spellStart"/>
+      <w:r>
+        <w:rPr>
+          <w:rFonts w:asciiTheme="majorBidi" w:hAnsiTheme="majorBidi" w:cstheme="majorBidi"/>
+        </w:rPr>
+        <w:t>boolean</w:t>
+      </w:r>
+      <w:proofErr w:type="spellEnd"/>
+    </w:p>
+    <w:p>
+      <w:pPr>
+        <w:rPr>
+          <w:rFonts w:asciiTheme="majorBidi" w:hAnsiTheme="majorBidi" w:cstheme="majorBidi"/>
+        </w:rPr>
+      </w:pPr>
+      <w:r>
+        <w:rPr>
+          <w:rFonts w:asciiTheme="majorBidi" w:hAnsiTheme="majorBidi" w:cstheme="majorBidi"/>
+        </w:rPr>
+        <w:t xml:space="preserve">  - Per-relation opt-out: store on Relation's Preference — </w:t>
+      </w:r>
+      <w:proofErr w:type="spellStart"/>
+      <w:r>
+        <w:rPr>
+          <w:rFonts w:asciiTheme="majorBidi" w:hAnsiTheme="majorBidi" w:cstheme="majorBidi"/>
+        </w:rPr>
+        <w:t>delivery_method</w:t>
+      </w:r>
+      <w:proofErr w:type="spellEnd"/>
+      <w:r>
+        <w:rPr>
+          <w:rFonts w:asciiTheme="majorBidi" w:hAnsiTheme="majorBidi" w:cstheme="majorBidi"/>
+        </w:rPr>
+        <w:t>: :</w:t>
+      </w:r>
+      <w:proofErr w:type="spellStart"/>
+      <w:r>
+        <w:rPr>
+          <w:rFonts w:asciiTheme="majorBidi" w:hAnsiTheme="majorBidi" w:cstheme="majorBidi"/>
+        </w:rPr>
+        <w:t>no_delivery</w:t>
+      </w:r>
+      <w:proofErr w:type="spellEnd"/>
+    </w:p>
+    <w:p>
+      <w:pPr>
+        <w:rPr>
+          <w:rFonts w:asciiTheme="majorBidi" w:hAnsiTheme="majorBidi" w:cstheme="majorBidi"/>
+        </w:rPr>
+      </w:pPr>
+    </w:p>
+    <w:p>
+      <w:pPr>
+        <w:rPr>
+          <w:rFonts w:asciiTheme="majorBidi" w:hAnsiTheme="majorBidi" w:cstheme="majorBidi"/>
+        </w:rPr>
+      </w:pPr>
+      <w:r>
+        <w:rPr>
+          <w:rFonts w:asciiTheme="majorBidi" w:hAnsiTheme="majorBidi" w:cstheme="majorBidi"/>
+        </w:rPr>
+        <w:t xml:space="preserve">  Phone/email changes → already triggers </w:t>
+      </w:r>
+      <w:proofErr w:type="spellStart"/>
+      <w:r>
+        <w:rPr>
+          <w:rFonts w:asciiTheme="majorBidi" w:hAnsiTheme="majorBidi" w:cstheme="majorBidi"/>
+        </w:rPr>
+        <w:t>process_future_messages</w:t>
+      </w:r>
+      <w:proofErr w:type="spellEnd"/>
+      <w:r>
+        <w:rPr>
+          <w:rFonts w:asciiTheme="majorBidi" w:hAnsiTheme="majorBidi" w:cstheme="majorBidi"/>
+        </w:rPr>
+        <w:t xml:space="preserve"> via </w:t>
+      </w:r>
+      <w:proofErr w:type="spellStart"/>
+      <w:r>
+        <w:rPr>
+          <w:rFonts w:asciiTheme="majorBidi" w:hAnsiTheme="majorBidi" w:cstheme="majorBidi"/>
+        </w:rPr>
+        <w:t>after_commit</w:t>
+      </w:r>
+      <w:proofErr w:type="spellEnd"/>
+      <w:r>
+        <w:rPr>
+          <w:rFonts w:asciiTheme="majorBidi" w:hAnsiTheme="majorBidi" w:cstheme="majorBidi"/>
+        </w:rPr>
+        <w:t>. This would work as-is.</w:t>
+      </w:r>
+    </w:p>
+    <w:p>
+      <w:pPr>
+        <w:rPr>
+          <w:rFonts w:asciiTheme="majorBidi" w:hAnsiTheme="majorBidi" w:cstheme="majorBidi"/>
+        </w:rPr>
+      </w:pPr>
+    </w:p>
+    <w:p>
+      <w:pPr>
+        <w:rPr>
+          <w:rFonts w:asciiTheme="majorBidi" w:hAnsiTheme="majorBidi" w:cstheme="majorBidi"/>
+        </w:rPr>
+      </w:pPr>
+      <w:r>
+        <w:rPr>
+          <w:rFonts w:asciiTheme="majorBidi" w:hAnsiTheme="majorBidi" w:cstheme="majorBidi"/>
+        </w:rPr>
+        <w:t xml:space="preserve">  What preferences make sense at contact level vs. relation level?</w:t>
+      </w:r>
+    </w:p>
+    <w:p>
+      <w:pPr>
+        <w:rPr>
+          <w:rFonts w:asciiTheme="majorBidi" w:hAnsiTheme="majorBidi" w:cstheme="majorBidi"/>
+        </w:rPr>
+      </w:pPr>
+      <w:r>
+        <w:rPr>
+          <w:rFonts w:asciiTheme="majorBidi" w:hAnsiTheme="majorBidi" w:cstheme="majorBidi"/>
+        </w:rPr>
+        <w:t xml:space="preserve">  - Contact level: phone, email, global opt-out, preferred delivery method (sms/</w:t>
+      </w:r>
+      <w:proofErr w:type="spellStart"/>
+      <w:r>
+        <w:rPr>
+          <w:rFonts w:asciiTheme="majorBidi" w:hAnsiTheme="majorBidi" w:cstheme="majorBidi"/>
+        </w:rPr>
+        <w:t>whatsapp</w:t>
+      </w:r>
+      <w:proofErr w:type="spellEnd"/>
+      <w:r>
+        <w:rPr>
+          <w:rFonts w:asciiTheme="majorBidi" w:hAnsiTheme="majorBidi" w:cstheme="majorBidi"/>
+        </w:rPr>
+        <w:t>/email)</w:t>
+      </w:r>
+    </w:p>
+    <w:p>
+      <w:pPr>
+        <w:rPr>
+          <w:rFonts w:asciiTheme="majorBidi" w:hAnsiTheme="majorBidi" w:cstheme="majorBidi"/>
+        </w:rPr>
+      </w:pPr>
+      <w:r>
+        <w:rPr>
+          <w:rFonts w:asciiTheme="majorBidi" w:hAnsiTheme="majorBidi" w:cstheme="majorBidi"/>
+        </w:rPr>
+        <w:t xml:space="preserve">  - Relation level: opt-out per deceased, possibly different days-before per relation</w:t>
+      </w:r>
+    </w:p>
+    <w:p>
+      <w:pPr>
+        <w:rPr>
+          <w:rFonts w:asciiTheme="majorBidi" w:hAnsiTheme="majorBidi" w:cstheme="majorBidi"/>
+        </w:rPr>
+      </w:pPr>
+    </w:p>
+    <w:p>
+      <w:pPr>
+        <w:rPr>
+          <w:rFonts w:asciiTheme="majorBidi" w:hAnsiTheme="majorBidi" w:cstheme="majorBidi"/>
+        </w:rPr>
+      </w:pPr>
+      <w:r>
+        <w:rPr>
+          <w:rFonts w:asciiTheme="majorBidi" w:hAnsiTheme="majorBidi" w:cstheme="majorBidi"/>
+        </w:rPr>
+        <w:t xml:space="preserve">  ---</w:t>
+      </w:r>
+    </w:p>
+    <w:p>
+      <w:pPr>
+        <w:rPr>
+          <w:rFonts w:asciiTheme="majorBidi" w:hAnsiTheme="majorBidi" w:cstheme="majorBidi"/>
+        </w:rPr>
+      </w:pPr>
+      <w:r>
+        <w:rPr>
+          <w:rFonts w:asciiTheme="majorBidi" w:hAnsiTheme="majorBidi" w:cstheme="majorBidi"/>
+        </w:rPr>
+        <w:t xml:space="preserve">  4a-c. "Other Venues" (landing page)</w:t>
+      </w:r>
+    </w:p>
+    <w:p>
+      <w:pPr>
+        <w:rPr>
+          <w:rFonts w:asciiTheme="majorBidi" w:hAnsiTheme="majorBidi" w:cstheme="majorBidi"/>
+        </w:rPr>
+      </w:pPr>
+      <w:r>
+        <w:rPr>
+          <w:rFonts w:asciiTheme="majorBidi" w:hAnsiTheme="majorBidi" w:cstheme="majorBidi"/>
+        </w:rPr>
+        <w:t xml:space="preserve">  Are these:</w:t>
+      </w:r>
+    </w:p>
+    <w:p>
+      <w:pPr>
+        <w:rPr>
+          <w:rFonts w:asciiTheme="majorBidi" w:hAnsiTheme="majorBidi" w:cstheme="majorBidi"/>
+        </w:rPr>
+      </w:pPr>
+      <w:r>
+        <w:rPr>
+          <w:rFonts w:asciiTheme="majorBidi" w:hAnsiTheme="majorBidi" w:cstheme="majorBidi"/>
+        </w:rPr>
+        <w:t xml:space="preserve">  - Fixed options (Kaddish, Seudah, etc.) that the admin enables/disables per community?</w:t>
+      </w:r>
+    </w:p>
+    <w:p>
+      <w:pPr>
+        <w:rPr>
+          <w:rFonts w:asciiTheme="majorBidi" w:hAnsiTheme="majorBidi" w:cstheme="majorBidi"/>
+        </w:rPr>
+      </w:pPr>
+      <w:r>
+        <w:rPr>
+          <w:rFonts w:asciiTheme="majorBidi" w:hAnsiTheme="majorBidi" w:cstheme="majorBidi"/>
+        </w:rPr>
+        <w:t xml:space="preserve">  - Or free-form content the admin writes (like the existing </w:t>
+      </w:r>
+      <w:proofErr w:type="gramStart"/>
+      <w:r>
+        <w:rPr>
+          <w:rFonts w:asciiTheme="majorBidi" w:hAnsiTheme="majorBidi" w:cstheme="majorBidi"/>
+        </w:rPr>
+        <w:t>Hke::</w:t>
+      </w:r>
+      <w:proofErr w:type="spellStart"/>
+      <w:proofErr w:type="gramEnd"/>
+      <w:r>
+        <w:rPr>
+          <w:rFonts w:asciiTheme="majorBidi" w:hAnsiTheme="majorBidi" w:cstheme="majorBidi"/>
+        </w:rPr>
+        <w:t>LandingPage</w:t>
+      </w:r>
+      <w:proofErr w:type="spellEnd"/>
+      <w:r>
+        <w:rPr>
+          <w:rFonts w:asciiTheme="majorBidi" w:hAnsiTheme="majorBidi" w:cstheme="majorBidi"/>
+        </w:rPr>
+        <w:t xml:space="preserve"> body field)?</w:t>
+      </w:r>
+    </w:p>
+    <w:p>
+      <w:pPr>
+        <w:rPr>
+          <w:rFonts w:asciiTheme="majorBidi" w:hAnsiTheme="majorBidi" w:cstheme="majorBidi"/>
+        </w:rPr>
+      </w:pPr>
+    </w:p>
+    <w:p>
+      <w:pPr>
+        <w:rPr>
+          <w:rFonts w:asciiTheme="majorBidi" w:hAnsiTheme="majorBidi" w:cstheme="majorBidi"/>
+        </w:rPr>
+      </w:pPr>
+      <w:r>
+        <w:rPr>
+          <w:rFonts w:asciiTheme="majorBidi" w:hAnsiTheme="majorBidi" w:cstheme="majorBidi"/>
+        </w:rPr>
+        <w:t xml:space="preserve">  The distinction matters architecturally — structured options let contacts RSVP/register, whereas free-form is</w:t>
+      </w:r>
+    </w:p>
+    <w:p>
+      <w:pPr>
+        <w:rPr>
+          <w:rFonts w:asciiTheme="majorBidi" w:hAnsiTheme="majorBidi" w:cstheme="majorBidi"/>
+        </w:rPr>
+      </w:pPr>
+      <w:r>
+        <w:rPr>
+          <w:rFonts w:asciiTheme="majorBidi" w:hAnsiTheme="majorBidi" w:cstheme="majorBidi"/>
+        </w:rPr>
+        <w:t xml:space="preserve">  just informational.</w:t>
+      </w:r>
+    </w:p>
+    <w:p>
+      <w:pPr>
+        <w:rPr>
+          <w:rFonts w:asciiTheme="majorBidi" w:hAnsiTheme="majorBidi" w:cstheme="majorBidi"/>
+        </w:rPr>
+      </w:pPr>
+    </w:p>
+    <w:p>
+      <w:pPr>
+        <w:rPr>
+          <w:rFonts w:asciiTheme="majorBidi" w:hAnsiTheme="majorBidi" w:cstheme="majorBidi"/>
+        </w:rPr>
+      </w:pPr>
+      <w:r>
+        <w:rPr>
+          <w:rFonts w:asciiTheme="majorBidi" w:hAnsiTheme="majorBidi" w:cstheme="majorBidi"/>
+        </w:rPr>
+        <w:lastRenderedPageBreak/>
+        <w:t xml:space="preserve">  ---</w:t>
+      </w:r>
+    </w:p>
+    <w:p>
+      <w:pPr>
+        <w:rPr>
+          <w:rFonts w:asciiTheme="majorBidi" w:hAnsiTheme="majorBidi" w:cstheme="majorBidi"/>
+        </w:rPr>
+      </w:pPr>
+      <w:r>
+        <w:rPr>
+          <w:rFonts w:asciiTheme="majorBidi" w:hAnsiTheme="majorBidi" w:cstheme="majorBidi"/>
+        </w:rPr>
+        <w:t xml:space="preserve">  5. The user account question — my recommendation</w:t>
+      </w:r>
+    </w:p>
+    <w:p>
+      <w:pPr>
+        <w:rPr>
+          <w:rFonts w:asciiTheme="majorBidi" w:hAnsiTheme="majorBidi" w:cstheme="majorBidi"/>
+        </w:rPr>
+      </w:pPr>
+    </w:p>
+    <w:p>
+      <w:pPr>
+        <w:rPr>
+          <w:rFonts w:asciiTheme="majorBidi" w:hAnsiTheme="majorBidi" w:cstheme="majorBidi"/>
+        </w:rPr>
+      </w:pPr>
+      <w:r>
+        <w:rPr>
+          <w:rFonts w:asciiTheme="majorBidi" w:hAnsiTheme="majorBidi" w:cstheme="majorBidi"/>
+        </w:rPr>
+        <w:t xml:space="preserve">  Don't require a Devise account. Here's why:</w:t>
+      </w:r>
+    </w:p>
+    <w:p>
+      <w:pPr>
+        <w:rPr>
+          <w:rFonts w:asciiTheme="majorBidi" w:hAnsiTheme="majorBidi" w:cstheme="majorBidi"/>
+        </w:rPr>
+      </w:pPr>
+      <w:r>
+        <w:rPr>
+          <w:rFonts w:asciiTheme="majorBidi" w:hAnsiTheme="majorBidi" w:cstheme="majorBidi"/>
+        </w:rPr>
+        <w:t xml:space="preserve">  - Contacts are typically older, less tech-savvy community members</w:t>
+      </w:r>
+    </w:p>
+    <w:p>
+      <w:pPr>
+        <w:rPr>
+          <w:rFonts w:asciiTheme="majorBidi" w:hAnsiTheme="majorBidi" w:cstheme="majorBidi"/>
+        </w:rPr>
+      </w:pPr>
+      <w:r>
+        <w:rPr>
+          <w:rFonts w:asciiTheme="majorBidi" w:hAnsiTheme="majorBidi" w:cstheme="majorBidi"/>
+        </w:rPr>
+        <w:t xml:space="preserve">  - They interact with the system once or twice a year</w:t>
+      </w:r>
+    </w:p>
+    <w:p>
+      <w:pPr>
+        <w:rPr>
+          <w:rFonts w:asciiTheme="majorBidi" w:hAnsiTheme="majorBidi" w:cstheme="majorBidi"/>
+        </w:rPr>
+      </w:pPr>
+      <w:r>
+        <w:rPr>
+          <w:rFonts w:asciiTheme="majorBidi" w:hAnsiTheme="majorBidi" w:cstheme="majorBidi"/>
+        </w:rPr>
+        <w:t xml:space="preserve">  - A permanent token link in every SMS is frictionless — they just tap and they're in</w:t>
+      </w:r>
+    </w:p>
+    <w:p>
+      <w:pPr>
+        <w:rPr>
+          <w:rFonts w:asciiTheme="majorBidi" w:hAnsiTheme="majorBidi" w:cstheme="majorBidi"/>
+        </w:rPr>
+      </w:pPr>
+      <w:r>
+        <w:rPr>
+          <w:rFonts w:asciiTheme="majorBidi" w:hAnsiTheme="majorBidi" w:cstheme="majorBidi"/>
+        </w:rPr>
+        <w:t xml:space="preserve">  - Creating an account adds friction that will reduce engagement significantly</w:t>
+      </w:r>
+    </w:p>
+    <w:p>
+      <w:pPr>
+        <w:rPr>
+          <w:rFonts w:asciiTheme="majorBidi" w:hAnsiTheme="majorBidi" w:cstheme="majorBidi"/>
+        </w:rPr>
+      </w:pPr>
+    </w:p>
+    <w:p>
+      <w:pPr>
+        <w:rPr>
+          <w:rFonts w:asciiTheme="majorBidi" w:hAnsiTheme="majorBidi" w:cstheme="majorBidi"/>
+        </w:rPr>
+      </w:pPr>
+      <w:r>
+        <w:rPr>
+          <w:rFonts w:asciiTheme="majorBidi" w:hAnsiTheme="majorBidi" w:cstheme="majorBidi"/>
+        </w:rPr>
+        <w:t xml:space="preserve">  What I'd suggest instead:</w:t>
+      </w:r>
+    </w:p>
+    <w:p>
+      <w:pPr>
+        <w:rPr>
+          <w:rFonts w:asciiTheme="majorBidi" w:hAnsiTheme="majorBidi" w:cstheme="majorBidi"/>
+        </w:rPr>
+      </w:pPr>
+      <w:r>
+        <w:rPr>
+          <w:rFonts w:asciiTheme="majorBidi" w:hAnsiTheme="majorBidi" w:cstheme="majorBidi"/>
+        </w:rPr>
+        <w:t xml:space="preserve">  - Permanent token = permanent access, no login needed</w:t>
+      </w:r>
+    </w:p>
+    <w:p>
+      <w:pPr>
+        <w:rPr>
+          <w:rFonts w:asciiTheme="majorBidi" w:hAnsiTheme="majorBidi" w:cstheme="majorBidi"/>
+        </w:rPr>
+      </w:pPr>
+      <w:r>
+        <w:rPr>
+          <w:rFonts w:asciiTheme="majorBidi" w:hAnsiTheme="majorBidi" w:cstheme="majorBidi"/>
+        </w:rPr>
+        <w:t xml:space="preserve">  - Optionally, let them set an email/password to "claim" their area if they want to return without the link — but</w:t>
+      </w:r>
+    </w:p>
+    <w:p>
+      <w:pPr>
+        <w:rPr>
+          <w:rFonts w:asciiTheme="majorBidi" w:hAnsiTheme="majorBidi" w:cstheme="majorBidi"/>
+        </w:rPr>
+      </w:pPr>
+      <w:r>
+        <w:rPr>
+          <w:rFonts w:asciiTheme="majorBidi" w:hAnsiTheme="majorBidi" w:cstheme="majorBidi"/>
+        </w:rPr>
+        <w:t xml:space="preserve">  don't require it</w:t>
+      </w:r>
+    </w:p>
+    <w:p>
+      <w:pPr>
+        <w:rPr>
+          <w:rFonts w:asciiTheme="majorBidi" w:hAnsiTheme="majorBidi" w:cstheme="majorBidi"/>
+        </w:rPr>
+      </w:pPr>
+      <w:r>
+        <w:rPr>
+          <w:rFonts w:asciiTheme="majorBidi" w:hAnsiTheme="majorBidi" w:cstheme="majorBidi"/>
+        </w:rPr>
+        <w:t xml:space="preserve">  - The 30-day window idea adds complexity without much benefit if the link is permanent</w:t>
+      </w:r>
+    </w:p>
+    <w:p>
+      <w:pPr>
+        <w:rPr>
+          <w:rFonts w:asciiTheme="majorBidi" w:hAnsiTheme="majorBidi" w:cstheme="majorBidi"/>
+        </w:rPr>
+      </w:pPr>
+    </w:p>
+    <w:p>
+      <w:pPr>
+        <w:rPr>
+          <w:rFonts w:asciiTheme="majorBidi" w:hAnsiTheme="majorBidi" w:cstheme="majorBidi"/>
+        </w:rPr>
+      </w:pPr>
+      <w:r>
+        <w:rPr>
+          <w:rFonts w:asciiTheme="majorBidi" w:hAnsiTheme="majorBidi" w:cstheme="majorBidi"/>
+        </w:rPr>
+        <w:t xml:space="preserve">  The Devise user model is for admins/community managers. Contacts are a different kind of actor — more like a</w:t>
+      </w:r>
+    </w:p>
+    <w:p>
+      <w:pPr>
+        <w:rPr>
+          <w:rFonts w:asciiTheme="majorBidi" w:hAnsiTheme="majorBidi" w:cstheme="majorBidi"/>
+        </w:rPr>
+      </w:pPr>
+      <w:r>
+        <w:rPr>
+          <w:rFonts w:asciiTheme="majorBidi" w:hAnsiTheme="majorBidi" w:cstheme="majorBidi"/>
+        </w:rPr>
+        <w:t xml:space="preserve">  "guest with a key."</w:t>
+      </w:r>
+    </w:p>
+    <w:p>
+      <w:pPr>
+        <w:rPr>
+          <w:rFonts w:asciiTheme="majorBidi" w:hAnsiTheme="majorBidi" w:cstheme="majorBidi"/>
+        </w:rPr>
+      </w:pPr>
+    </w:p>
+    <w:p>
+      <w:pPr>
+        <w:rPr>
+          <w:rFonts w:asciiTheme="majorBidi" w:hAnsiTheme="majorBidi" w:cstheme="majorBidi"/>
+        </w:rPr>
+      </w:pPr>
+      <w:r>
+        <w:rPr>
+          <w:rFonts w:asciiTheme="majorBidi" w:hAnsiTheme="majorBidi" w:cstheme="majorBidi"/>
+        </w:rPr>
+        <w:t xml:space="preserve">  ---</w:t>
+      </w:r>
+    </w:p>
+    <w:p>
+      <w:pPr>
+        <w:rPr>
+          <w:rFonts w:asciiTheme="majorBidi" w:hAnsiTheme="majorBidi" w:cstheme="majorBidi"/>
+        </w:rPr>
+      </w:pPr>
+      <w:r>
+        <w:rPr>
+          <w:rFonts w:asciiTheme="majorBidi" w:hAnsiTheme="majorBidi" w:cstheme="majorBidi"/>
+        </w:rPr>
+        <w:t xml:space="preserve">  Key decisions still needed before we plan implementation:</w:t>
+      </w:r>
+    </w:p>
+    <w:p>
+      <w:pPr>
+        <w:rPr>
+          <w:rFonts w:asciiTheme="majorBidi" w:hAnsiTheme="majorBidi" w:cstheme="majorBidi"/>
+        </w:rPr>
+      </w:pPr>
+    </w:p>
+    <w:p>
+      <w:pPr>
+        <w:rPr>
+          <w:rFonts w:asciiTheme="majorBidi" w:hAnsiTheme="majorBidi" w:cstheme="majorBidi"/>
+        </w:rPr>
+      </w:pPr>
+      <w:r>
+        <w:rPr>
+          <w:rFonts w:asciiTheme="majorBidi" w:hAnsiTheme="majorBidi" w:cstheme="majorBidi"/>
+        </w:rPr>
+        <w:t xml:space="preserve">  1. Are "Other Venues" structured (RSVP-able) or free-form content?</w:t>
+      </w:r>
+    </w:p>
+    <w:p>
+      <w:pPr>
+        <w:rPr>
+          <w:rFonts w:asciiTheme="majorBidi" w:hAnsiTheme="majorBidi" w:cstheme="majorBidi"/>
+        </w:rPr>
+      </w:pPr>
+      <w:r>
+        <w:rPr>
+          <w:rFonts w:asciiTheme="majorBidi" w:hAnsiTheme="majorBidi" w:cstheme="majorBidi"/>
+        </w:rPr>
+        <w:t xml:space="preserve">  2. Should contacts be able to change days-before preferences, or only delivery method + opt-out?</w:t>
+      </w:r>
+    </w:p>
+    <w:p>
+      <w:pPr>
+        <w:rPr>
+          <w:rFonts w:asciiTheme="majorBidi" w:hAnsiTheme="majorBidi" w:cstheme="majorBidi"/>
+        </w:rPr>
+      </w:pPr>
+      <w:r>
+        <w:rPr>
+          <w:rFonts w:asciiTheme="majorBidi" w:hAnsiTheme="majorBidi" w:cstheme="majorBidi"/>
+        </w:rPr>
+        <w:t xml:space="preserve">  3. Should the self-service area support Hebrew only, or also English?</w:t>
+      </w:r>
+    </w:p>
+    <w:p>
+      <w:pPr>
+        <w:rPr>
+          <w:rFonts w:asciiTheme="majorBidi" w:hAnsiTheme="majorBidi" w:cstheme="majorBidi"/>
+        </w:rPr>
+      </w:pPr>
+      <w:r>
+        <w:rPr>
+          <w:rFonts w:asciiTheme="majorBidi" w:hAnsiTheme="majorBidi" w:cstheme="majorBidi"/>
+        </w:rPr>
+        <w:t xml:space="preserve">  4. Do you want an optional "claim your account" flow, or strictly token-only?</w:t>
+      </w:r>
+    </w:p>
+    <w:p>
+      <w:pPr>
+        <w:rPr>
+          <w:rFonts w:asciiTheme="majorBidi" w:hAnsiTheme="majorBidi" w:cstheme="majorBidi"/>
+        </w:rPr>
+      </w:pPr>
+    </w:p>
+    <w:p>
+      <w:pPr>
+        <w:rPr>
+          <w:rFonts w:asciiTheme="majorBidi" w:hAnsiTheme="majorBidi" w:cstheme="majorBidi"/>
+        </w:rPr>
+      </w:pPr>
+      <w:r>
+        <w:rPr>
+          <w:rFonts w:asciiTheme="majorBidi" w:hAnsiTheme="majorBidi" w:cstheme="majorBidi"/>
+        </w:rPr>
+        <w:br/>
+        <w:t>---- me:</w:t>
+      </w:r>
+      <w:r>
+        <w:rPr>
+          <w:rFonts w:asciiTheme="majorBidi" w:hAnsiTheme="majorBidi" w:cstheme="majorBidi"/>
+        </w:rPr>
+        <w:br/>
+        <w:t xml:space="preserve">We’ll need a </w:t>
+      </w:r>
+      <w:proofErr w:type="spellStart"/>
+      <w:r>
+        <w:rPr>
+          <w:rFonts w:asciiTheme="majorBidi" w:hAnsiTheme="majorBidi" w:cstheme="majorBidi"/>
+        </w:rPr>
+        <w:t>url</w:t>
+      </w:r>
+      <w:proofErr w:type="spellEnd"/>
+      <w:r>
+        <w:rPr>
+          <w:rFonts w:asciiTheme="majorBidi" w:hAnsiTheme="majorBidi" w:cstheme="majorBidi"/>
+        </w:rPr>
+        <w:t xml:space="preserve"> shortening service so that the </w:t>
+      </w:r>
+      <w:proofErr w:type="spellStart"/>
+      <w:r>
+        <w:rPr>
+          <w:rFonts w:asciiTheme="majorBidi" w:hAnsiTheme="majorBidi" w:cstheme="majorBidi"/>
+        </w:rPr>
+        <w:t>url</w:t>
+      </w:r>
+      <w:proofErr w:type="spellEnd"/>
+      <w:r>
+        <w:rPr>
+          <w:rFonts w:asciiTheme="majorBidi" w:hAnsiTheme="majorBidi" w:cstheme="majorBidi"/>
+        </w:rPr>
+        <w:t xml:space="preserve"> in the sms is not too long. Some sms apps don’t convert a </w:t>
+      </w:r>
+      <w:proofErr w:type="spellStart"/>
+      <w:r>
+        <w:rPr>
+          <w:rFonts w:asciiTheme="majorBidi" w:hAnsiTheme="majorBidi" w:cstheme="majorBidi"/>
+        </w:rPr>
+        <w:t>url</w:t>
+      </w:r>
+      <w:proofErr w:type="spellEnd"/>
+      <w:r>
+        <w:rPr>
+          <w:rFonts w:asciiTheme="majorBidi" w:hAnsiTheme="majorBidi" w:cstheme="majorBidi"/>
+        </w:rPr>
+        <w:t xml:space="preserve"> to a hyperlink, it’s just text. The user will have to copy and paste it into a browser in some cases.</w:t>
+      </w:r>
+    </w:p>
+    <w:p>
+      <w:pPr>
+        <w:rPr>
+          <w:rFonts w:asciiTheme="majorBidi" w:hAnsiTheme="majorBidi" w:cstheme="majorBidi"/>
+        </w:rPr>
+      </w:pPr>
+    </w:p>
+    <w:p>
+      <w:pPr>
+        <w:rPr>
+          <w:rFonts w:asciiTheme="majorBidi" w:hAnsiTheme="majorBidi" w:cstheme="majorBidi"/>
+        </w:rPr>
+      </w:pPr>
+      <w:r>
+        <w:rPr>
+          <w:rFonts w:asciiTheme="majorBidi" w:hAnsiTheme="majorBidi" w:cstheme="majorBidi"/>
+        </w:rPr>
+        <w:t>In answer to your questions:</w:t>
+      </w:r>
+    </w:p>
+    <w:p>
+      <w:pPr>
+        <w:pStyle w:val="ListParagraph"/>
+        <w:numPr>
+          <w:ilvl w:val="0"/>
+          <w:numId w:val="8"/>
+        </w:numPr>
+        <w:rPr>
+          <w:rFonts w:asciiTheme="majorBidi" w:hAnsiTheme="majorBidi" w:cstheme="majorBidi"/>
+        </w:rPr>
+      </w:pPr>
+      <w:r>
+        <w:rPr>
+          <w:rFonts w:asciiTheme="majorBidi" w:hAnsiTheme="majorBidi" w:cstheme="majorBidi"/>
+        </w:rPr>
+        <w:t xml:space="preserve">The venues will be a combination of structured  (the first two will be, and if the user selects </w:t>
+      </w:r>
+      <w:proofErr w:type="gramStart"/>
+      <w:r>
+        <w:rPr>
+          <w:rFonts w:asciiTheme="majorBidi" w:hAnsiTheme="majorBidi" w:cstheme="majorBidi"/>
+        </w:rPr>
+        <w:t>them</w:t>
+      </w:r>
+      <w:proofErr w:type="gramEnd"/>
+      <w:r>
+        <w:rPr>
+          <w:rFonts w:asciiTheme="majorBidi" w:hAnsiTheme="majorBidi" w:cstheme="majorBidi"/>
+        </w:rPr>
+        <w:t xml:space="preserve"> he will navigate to a service page with details, and a link to request it (this flow has to be designed. Initially I was thinking that just to see uptake we’ll send an email to the community admin with the </w:t>
+      </w:r>
+      <w:proofErr w:type="gramStart"/>
+      <w:r>
+        <w:rPr>
+          <w:rFonts w:asciiTheme="majorBidi" w:hAnsiTheme="majorBidi" w:cstheme="majorBidi"/>
+        </w:rPr>
+        <w:t>request, and</w:t>
+      </w:r>
+      <w:proofErr w:type="gramEnd"/>
+      <w:r>
+        <w:rPr>
+          <w:rFonts w:asciiTheme="majorBidi" w:hAnsiTheme="majorBidi" w:cstheme="majorBidi"/>
+        </w:rPr>
+        <w:t xml:space="preserve"> log it) Other venues will be just free text. This whole area is </w:t>
+      </w:r>
+      <w:proofErr w:type="gramStart"/>
+      <w:r>
+        <w:rPr>
+          <w:rFonts w:asciiTheme="majorBidi" w:hAnsiTheme="majorBidi" w:cstheme="majorBidi"/>
+        </w:rPr>
+        <w:t>community-dependent</w:t>
+      </w:r>
+      <w:proofErr w:type="gramEnd"/>
+      <w:r>
+        <w:rPr>
+          <w:rFonts w:asciiTheme="majorBidi" w:hAnsiTheme="majorBidi" w:cstheme="majorBidi"/>
+        </w:rPr>
+        <w:t>.</w:t>
+      </w:r>
+    </w:p>
+    <w:p>
+      <w:pPr>
+        <w:pStyle w:val="ListParagraph"/>
+        <w:numPr>
+          <w:ilvl w:val="0"/>
+          <w:numId w:val="8"/>
+        </w:numPr>
+        <w:rPr>
+          <w:rFonts w:asciiTheme="majorBidi" w:hAnsiTheme="majorBidi" w:cstheme="majorBidi"/>
+        </w:rPr>
+      </w:pPr>
+      <w:r>
+        <w:rPr>
+          <w:rFonts w:asciiTheme="majorBidi" w:hAnsiTheme="majorBidi" w:cstheme="majorBidi"/>
+        </w:rPr>
+        <w:t>Yes, they should be able to change the days before</w:t>
+      </w:r>
+    </w:p>
+    <w:p>
+      <w:pPr>
+        <w:pStyle w:val="ListParagraph"/>
+        <w:numPr>
+          <w:ilvl w:val="0"/>
+          <w:numId w:val="8"/>
+        </w:numPr>
+        <w:rPr>
+          <w:rFonts w:asciiTheme="majorBidi" w:hAnsiTheme="majorBidi" w:cstheme="majorBidi"/>
+        </w:rPr>
+      </w:pPr>
+      <w:r>
+        <w:rPr>
+          <w:rFonts w:asciiTheme="majorBidi" w:hAnsiTheme="majorBidi" w:cstheme="majorBidi"/>
+        </w:rPr>
+        <w:t>I see the issue, as there might be a lot of text. But it needs to be internationalized, as I see in the future some overseas communities such as in the US making use of the system</w:t>
+      </w:r>
+    </w:p>
+    <w:p>
+      <w:pPr>
+        <w:pStyle w:val="ListParagraph"/>
+        <w:numPr>
+          <w:ilvl w:val="0"/>
+          <w:numId w:val="8"/>
+        </w:numPr>
+        <w:rPr>
+          <w:rFonts w:asciiTheme="majorBidi" w:hAnsiTheme="majorBidi" w:cstheme="majorBidi"/>
+        </w:rPr>
+      </w:pPr>
+      <w:r>
+        <w:rPr>
+          <w:rFonts w:asciiTheme="majorBidi" w:hAnsiTheme="majorBidi" w:cstheme="majorBidi"/>
+        </w:rPr>
+        <w:t>Let’s stick with token only</w:t>
+      </w:r>
+    </w:p>
+    <w:p>
+      <w:pPr>
+        <w:rPr>
+          <w:rFonts w:asciiTheme="majorBidi" w:hAnsiTheme="majorBidi" w:cstheme="majorBidi"/>
+        </w:rPr>
+      </w:pPr>
+    </w:p>
+    <w:p>
+      <w:pPr>
+        <w:rPr>
+          <w:rFonts w:asciiTheme="majorBidi" w:hAnsiTheme="majorBidi" w:cstheme="majorBidi"/>
+        </w:rPr>
+      </w:pPr>
+    </w:p>
+    <w:p>
+      <w:pPr>
+        <w:rPr>
+          <w:rFonts w:asciiTheme="majorBidi" w:hAnsiTheme="majorBidi" w:cstheme="majorBidi"/>
+        </w:rPr>
+      </w:pPr>
+      <w:r>
+        <w:rPr>
+          <w:rFonts w:asciiTheme="majorBidi" w:hAnsiTheme="majorBidi" w:cstheme="majorBidi"/>
+        </w:rPr>
+        <w:t xml:space="preserve">------ </w:t>
+      </w:r>
+      <w:proofErr w:type="spellStart"/>
+      <w:r>
+        <w:rPr>
+          <w:rFonts w:asciiTheme="majorBidi" w:hAnsiTheme="majorBidi" w:cstheme="majorBidi"/>
+        </w:rPr>
+        <w:t>claude</w:t>
+      </w:r>
+      <w:proofErr w:type="spellEnd"/>
+      <w:r>
+        <w:rPr>
+          <w:rFonts w:asciiTheme="majorBidi" w:hAnsiTheme="majorBidi" w:cstheme="majorBidi"/>
+        </w:rPr>
+        <w:t>:</w:t>
+      </w:r>
+      <w:r>
+        <w:rPr>
+          <w:rFonts w:asciiTheme="majorBidi" w:hAnsiTheme="majorBidi" w:cstheme="majorBidi"/>
+        </w:rPr>
+        <w:br/>
+      </w:r>
+      <w:r>
+        <w:rPr>
+          <w:rFonts w:ascii="Apple Color Emoji" w:hAnsi="Apple Color Emoji" w:cs="Apple Color Emoji"/>
+        </w:rPr>
+        <w:t>⏺</w:t>
+      </w:r>
+      <w:r>
+        <w:rPr>
+          <w:rFonts w:asciiTheme="majorBidi" w:hAnsiTheme="majorBidi" w:cstheme="majorBidi"/>
+        </w:rPr>
+        <w:t xml:space="preserve"> Good thinking on URL length — this is important. Let me address it and then summarize the full architecture.</w:t>
+      </w:r>
+    </w:p>
+    <w:p>
+      <w:pPr>
+        <w:rPr>
+          <w:rFonts w:asciiTheme="majorBidi" w:hAnsiTheme="majorBidi" w:cstheme="majorBidi"/>
+        </w:rPr>
+      </w:pPr>
+    </w:p>
+    <w:p>
+      <w:pPr>
+        <w:rPr>
+          <w:rFonts w:asciiTheme="majorBidi" w:hAnsiTheme="majorBidi" w:cstheme="majorBidi"/>
+        </w:rPr>
+      </w:pPr>
+      <w:r>
+        <w:rPr>
+          <w:rFonts w:asciiTheme="majorBidi" w:hAnsiTheme="majorBidi" w:cstheme="majorBidi"/>
+        </w:rPr>
+        <w:t xml:space="preserve">  ---</w:t>
+      </w:r>
+    </w:p>
+    <w:p>
+      <w:pPr>
+        <w:rPr>
+          <w:rFonts w:asciiTheme="majorBidi" w:hAnsiTheme="majorBidi" w:cstheme="majorBidi"/>
+        </w:rPr>
+      </w:pPr>
+      <w:r>
+        <w:rPr>
+          <w:rFonts w:asciiTheme="majorBidi" w:hAnsiTheme="majorBidi" w:cstheme="majorBidi"/>
+        </w:rPr>
+        <w:t xml:space="preserve">  URL Shortening — build our own</w:t>
+      </w:r>
+    </w:p>
+    <w:p>
+      <w:pPr>
+        <w:rPr>
+          <w:rFonts w:asciiTheme="majorBidi" w:hAnsiTheme="majorBidi" w:cstheme="majorBidi"/>
+        </w:rPr>
+      </w:pPr>
+    </w:p>
+    <w:p>
+      <w:pPr>
+        <w:rPr>
+          <w:rFonts w:asciiTheme="majorBidi" w:hAnsiTheme="majorBidi" w:cstheme="majorBidi"/>
+        </w:rPr>
+      </w:pPr>
+      <w:r>
+        <w:rPr>
+          <w:rFonts w:asciiTheme="majorBidi" w:hAnsiTheme="majorBidi" w:cstheme="majorBidi"/>
+        </w:rPr>
+        <w:t xml:space="preserve">  I'd recommend a simple in-house shortener rather than </w:t>
+      </w:r>
+      <w:proofErr w:type="spellStart"/>
+      <w:r>
+        <w:rPr>
+          <w:rFonts w:asciiTheme="majorBidi" w:hAnsiTheme="majorBidi" w:cstheme="majorBidi"/>
+        </w:rPr>
+        <w:t>Bitly</w:t>
+      </w:r>
+      <w:proofErr w:type="spellEnd"/>
+      <w:r>
+        <w:rPr>
+          <w:rFonts w:asciiTheme="majorBidi" w:hAnsiTheme="majorBidi" w:cstheme="majorBidi"/>
+        </w:rPr>
+        <w:t>/</w:t>
+      </w:r>
+      <w:proofErr w:type="spellStart"/>
+      <w:r>
+        <w:rPr>
+          <w:rFonts w:asciiTheme="majorBidi" w:hAnsiTheme="majorBidi" w:cstheme="majorBidi"/>
+        </w:rPr>
+        <w:t>TinyURL</w:t>
+      </w:r>
+      <w:proofErr w:type="spellEnd"/>
+      <w:r>
+        <w:rPr>
+          <w:rFonts w:asciiTheme="majorBidi" w:hAnsiTheme="majorBidi" w:cstheme="majorBidi"/>
+        </w:rPr>
+        <w:t>. Reasons: privacy (you're sending links about</w:t>
+      </w:r>
+    </w:p>
+    <w:p>
+      <w:pPr>
+        <w:rPr>
+          <w:rFonts w:asciiTheme="majorBidi" w:hAnsiTheme="majorBidi" w:cstheme="majorBidi"/>
+        </w:rPr>
+      </w:pPr>
+      <w:r>
+        <w:rPr>
+          <w:rFonts w:asciiTheme="majorBidi" w:hAnsiTheme="majorBidi" w:cstheme="majorBidi"/>
+        </w:rPr>
+        <w:lastRenderedPageBreak/>
+        <w:t xml:space="preserve">   bereaved families), no external dependency, and it's genuinely simple to build.</w:t>
+      </w:r>
+    </w:p>
+    <w:p>
+      <w:pPr>
+        <w:rPr>
+          <w:rFonts w:asciiTheme="majorBidi" w:hAnsiTheme="majorBidi" w:cstheme="majorBidi"/>
+        </w:rPr>
+      </w:pPr>
+    </w:p>
+    <w:p>
+      <w:pPr>
+        <w:rPr>
+          <w:rFonts w:asciiTheme="majorBidi" w:hAnsiTheme="majorBidi" w:cstheme="majorBidi"/>
+        </w:rPr>
+      </w:pPr>
+      <w:r>
+        <w:rPr>
+          <w:rFonts w:asciiTheme="majorBidi" w:hAnsiTheme="majorBidi" w:cstheme="majorBidi"/>
+        </w:rPr>
+        <w:t xml:space="preserve">  A </w:t>
+      </w:r>
+      <w:proofErr w:type="spellStart"/>
+      <w:r>
+        <w:rPr>
+          <w:rFonts w:asciiTheme="majorBidi" w:hAnsiTheme="majorBidi" w:cstheme="majorBidi"/>
+        </w:rPr>
+        <w:t>hke_short_links</w:t>
+      </w:r>
+      <w:proofErr w:type="spellEnd"/>
+      <w:r>
+        <w:rPr>
+          <w:rFonts w:asciiTheme="majorBidi" w:hAnsiTheme="majorBidi" w:cstheme="majorBidi"/>
+        </w:rPr>
+        <w:t xml:space="preserve"> table:</w:t>
+      </w:r>
+    </w:p>
+    <w:p>
+      <w:pPr>
+        <w:rPr>
+          <w:rFonts w:asciiTheme="majorBidi" w:hAnsiTheme="majorBidi" w:cstheme="majorBidi"/>
+        </w:rPr>
+      </w:pPr>
+      <w:r>
+        <w:rPr>
+          <w:rFonts w:asciiTheme="majorBidi" w:hAnsiTheme="majorBidi" w:cstheme="majorBidi"/>
+        </w:rPr>
+        <w:t xml:space="preserve">  - code — 6-7 random alphanumeric chars (e.g. hkl.io/xK9mPq)</w:t>
+      </w:r>
+    </w:p>
+    <w:p>
+      <w:pPr>
+        <w:rPr>
+          <w:rFonts w:asciiTheme="majorBidi" w:hAnsiTheme="majorBidi" w:cstheme="majorBidi"/>
+        </w:rPr>
+      </w:pPr>
+      <w:r>
+        <w:rPr>
+          <w:rFonts w:asciiTheme="majorBidi" w:hAnsiTheme="majorBidi" w:cstheme="majorBidi"/>
+        </w:rPr>
+        <w:t xml:space="preserve">  - </w:t>
+      </w:r>
+      <w:proofErr w:type="spellStart"/>
+      <w:r>
+        <w:rPr>
+          <w:rFonts w:asciiTheme="majorBidi" w:hAnsiTheme="majorBidi" w:cstheme="majorBidi"/>
+        </w:rPr>
+        <w:t>contact_person_id</w:t>
+      </w:r>
+      <w:proofErr w:type="spellEnd"/>
+      <w:r>
+        <w:rPr>
+          <w:rFonts w:asciiTheme="majorBidi" w:hAnsiTheme="majorBidi" w:cstheme="majorBidi"/>
+        </w:rPr>
+        <w:t xml:space="preserve"> — who it's for</w:t>
+      </w:r>
+    </w:p>
+    <w:p>
+      <w:pPr>
+        <w:rPr>
+          <w:rFonts w:asciiTheme="majorBidi" w:hAnsiTheme="majorBidi" w:cstheme="majorBidi"/>
+        </w:rPr>
+      </w:pPr>
+      <w:r>
+        <w:rPr>
+          <w:rFonts w:asciiTheme="majorBidi" w:hAnsiTheme="majorBidi" w:cstheme="majorBidi"/>
+        </w:rPr>
+        <w:t xml:space="preserve">  - </w:t>
+      </w:r>
+      <w:proofErr w:type="spellStart"/>
+      <w:r>
+        <w:rPr>
+          <w:rFonts w:asciiTheme="majorBidi" w:hAnsiTheme="majorBidi" w:cstheme="majorBidi"/>
+        </w:rPr>
+        <w:t>via_token</w:t>
+      </w:r>
+      <w:proofErr w:type="spellEnd"/>
+      <w:r>
+        <w:rPr>
+          <w:rFonts w:asciiTheme="majorBidi" w:hAnsiTheme="majorBidi" w:cstheme="majorBidi"/>
+        </w:rPr>
+        <w:t xml:space="preserve"> — which </w:t>
+      </w:r>
+      <w:proofErr w:type="spellStart"/>
+      <w:r>
+        <w:rPr>
+          <w:rFonts w:asciiTheme="majorBidi" w:hAnsiTheme="majorBidi" w:cstheme="majorBidi"/>
+        </w:rPr>
+        <w:t>FutureMessage</w:t>
+      </w:r>
+      <w:proofErr w:type="spellEnd"/>
+      <w:r>
+        <w:rPr>
+          <w:rFonts w:asciiTheme="majorBidi" w:hAnsiTheme="majorBidi" w:cstheme="majorBidi"/>
+        </w:rPr>
+        <w:t xml:space="preserve"> triggered it (for first-access tracking)</w:t>
+      </w:r>
+    </w:p>
+    <w:p>
+      <w:pPr>
+        <w:rPr>
+          <w:rFonts w:asciiTheme="majorBidi" w:hAnsiTheme="majorBidi" w:cstheme="majorBidi"/>
+        </w:rPr>
+      </w:pPr>
+      <w:r>
+        <w:rPr>
+          <w:rFonts w:asciiTheme="majorBidi" w:hAnsiTheme="majorBidi" w:cstheme="majorBidi"/>
+        </w:rPr>
+        <w:t xml:space="preserve">  - </w:t>
+      </w:r>
+      <w:proofErr w:type="spellStart"/>
+      <w:r>
+        <w:rPr>
+          <w:rFonts w:asciiTheme="majorBidi" w:hAnsiTheme="majorBidi" w:cstheme="majorBidi"/>
+        </w:rPr>
+        <w:t>first_clicked_at</w:t>
+      </w:r>
+      <w:proofErr w:type="spellEnd"/>
+      <w:r>
+        <w:rPr>
+          <w:rFonts w:asciiTheme="majorBidi" w:hAnsiTheme="majorBidi" w:cstheme="majorBidi"/>
+        </w:rPr>
+        <w:t xml:space="preserve">, </w:t>
+      </w:r>
+      <w:proofErr w:type="spellStart"/>
+      <w:r>
+        <w:rPr>
+          <w:rFonts w:asciiTheme="majorBidi" w:hAnsiTheme="majorBidi" w:cstheme="majorBidi"/>
+        </w:rPr>
+        <w:t>click_count</w:t>
+      </w:r>
+      <w:proofErr w:type="spellEnd"/>
+    </w:p>
+    <w:p>
+      <w:pPr>
+        <w:rPr>
+          <w:rFonts w:asciiTheme="majorBidi" w:hAnsiTheme="majorBidi" w:cstheme="majorBidi"/>
+        </w:rPr>
+      </w:pPr>
+    </w:p>
+    <w:p>
+      <w:pPr>
+        <w:rPr>
+          <w:rFonts w:asciiTheme="majorBidi" w:hAnsiTheme="majorBidi" w:cstheme="majorBidi"/>
+        </w:rPr>
+      </w:pPr>
+      <w:r>
+        <w:rPr>
+          <w:rFonts w:asciiTheme="majorBidi" w:hAnsiTheme="majorBidi" w:cstheme="majorBidi"/>
+        </w:rPr>
+        <w:t xml:space="preserve">  Each SMS gets its own short link generated at send time. URL becomes something like https://hakhel.app/go/xK9mPq</w:t>
+      </w:r>
+    </w:p>
+    <w:p>
+      <w:pPr>
+        <w:rPr>
+          <w:rFonts w:asciiTheme="majorBidi" w:hAnsiTheme="majorBidi" w:cstheme="majorBidi"/>
+        </w:rPr>
+      </w:pPr>
+      <w:r>
+        <w:rPr>
+          <w:rFonts w:asciiTheme="majorBidi" w:hAnsiTheme="majorBidi" w:cstheme="majorBidi"/>
+        </w:rPr>
+        <w:t xml:space="preserve">  — short enough to type manually.</w:t>
+      </w:r>
+    </w:p>
+    <w:p>
+      <w:pPr>
+        <w:rPr>
+          <w:rFonts w:asciiTheme="majorBidi" w:hAnsiTheme="majorBidi" w:cstheme="majorBidi"/>
+        </w:rPr>
+      </w:pPr>
+    </w:p>
+    <w:p>
+      <w:pPr>
+        <w:rPr>
+          <w:rFonts w:asciiTheme="majorBidi" w:hAnsiTheme="majorBidi" w:cstheme="majorBidi"/>
+        </w:rPr>
+      </w:pPr>
+      <w:r>
+        <w:rPr>
+          <w:rFonts w:asciiTheme="majorBidi" w:hAnsiTheme="majorBidi" w:cstheme="majorBidi"/>
+        </w:rPr>
+        <w:t xml:space="preserve">  One question: do you have a short domain, or would you use the main app domain?</w:t>
+      </w:r>
+    </w:p>
+    <w:p>
+      <w:pPr>
+        <w:rPr>
+          <w:rFonts w:asciiTheme="majorBidi" w:hAnsiTheme="majorBidi" w:cstheme="majorBidi"/>
+        </w:rPr>
+      </w:pPr>
+    </w:p>
+    <w:p>
+      <w:pPr>
+        <w:rPr>
+          <w:rFonts w:asciiTheme="majorBidi" w:hAnsiTheme="majorBidi" w:cstheme="majorBidi"/>
+        </w:rPr>
+      </w:pPr>
+      <w:r>
+        <w:rPr>
+          <w:rFonts w:asciiTheme="majorBidi" w:hAnsiTheme="majorBidi" w:cstheme="majorBidi"/>
+        </w:rPr>
+        <w:t xml:space="preserve">  ---</w:t>
+      </w:r>
+    </w:p>
+    <w:p>
+      <w:pPr>
+        <w:rPr>
+          <w:rFonts w:asciiTheme="majorBidi" w:hAnsiTheme="majorBidi" w:cstheme="majorBidi"/>
+        </w:rPr>
+      </w:pPr>
+      <w:r>
+        <w:rPr>
+          <w:rFonts w:asciiTheme="majorBidi" w:hAnsiTheme="majorBidi" w:cstheme="majorBidi"/>
+        </w:rPr>
+        <w:t xml:space="preserve">  Full architecture summary</w:t>
+      </w:r>
+    </w:p>
+    <w:p>
+      <w:pPr>
+        <w:rPr>
+          <w:rFonts w:asciiTheme="majorBidi" w:hAnsiTheme="majorBidi" w:cstheme="majorBidi"/>
+        </w:rPr>
+      </w:pPr>
+    </w:p>
+    <w:p>
+      <w:pPr>
+        <w:rPr>
+          <w:rFonts w:asciiTheme="majorBidi" w:hAnsiTheme="majorBidi" w:cstheme="majorBidi"/>
+        </w:rPr>
+      </w:pPr>
+      <w:r>
+        <w:rPr>
+          <w:rFonts w:asciiTheme="majorBidi" w:hAnsiTheme="majorBidi" w:cstheme="majorBidi"/>
+        </w:rPr>
+        <w:t xml:space="preserve">  New DB models:</w:t>
+      </w:r>
+    </w:p>
+    <w:p>
+      <w:pPr>
+        <w:rPr>
+          <w:rFonts w:asciiTheme="majorBidi" w:hAnsiTheme="majorBidi" w:cstheme="majorBidi"/>
+        </w:rPr>
+      </w:pPr>
+    </w:p>
+    <w:p>
+      <w:pPr>
+        <w:rPr>
+          <w:rFonts w:asciiTheme="majorBidi" w:hAnsiTheme="majorBidi" w:cstheme="majorBidi"/>
+        </w:rPr>
+      </w:pPr>
+      <w:r>
+        <w:rPr>
+          <w:rFonts w:asciiTheme="majorBidi" w:hAnsiTheme="majorBidi" w:cstheme="majorBidi"/>
+        </w:rPr>
+        <w:t xml:space="preserve">  ┌───────────────────────┬────────────────────────────────────────────────────────────────────────────────────┐</w:t>
+      </w:r>
+    </w:p>
+    <w:p>
+      <w:pPr>
+        <w:rPr>
+          <w:rFonts w:asciiTheme="majorBidi" w:hAnsiTheme="majorBidi" w:cstheme="majorBidi"/>
+        </w:rPr>
+      </w:pPr>
+      <w:r>
+        <w:rPr>
+          <w:rFonts w:asciiTheme="majorBidi" w:hAnsiTheme="majorBidi" w:cstheme="majorBidi"/>
+        </w:rPr>
+        <w:t xml:space="preserve">  │         Model         │                                      Purpose                                       │</w:t>
+      </w:r>
+    </w:p>
+    <w:p>
+      <w:pPr>
+        <w:rPr>
+          <w:rFonts w:asciiTheme="majorBidi" w:hAnsiTheme="majorBidi" w:cstheme="majorBidi"/>
+        </w:rPr>
+      </w:pPr>
+      <w:r>
+        <w:rPr>
+          <w:rFonts w:asciiTheme="majorBidi" w:hAnsiTheme="majorBidi" w:cstheme="majorBidi"/>
+        </w:rPr>
+        <w:t xml:space="preserve">  ├───────────────────────┼────────────────────────────────────────────────────────────────────────────────────┤</w:t>
+      </w:r>
+    </w:p>
+    <w:p>
+      <w:pPr>
+        <w:rPr>
+          <w:rFonts w:asciiTheme="majorBidi" w:hAnsiTheme="majorBidi" w:cstheme="majorBidi"/>
+        </w:rPr>
+      </w:pPr>
+      <w:r>
+        <w:rPr>
+          <w:rFonts w:asciiTheme="majorBidi" w:hAnsiTheme="majorBidi" w:cstheme="majorBidi"/>
+        </w:rPr>
+        <w:t xml:space="preserve">  │ token on              │ Permanent contact identity                                                         │</w:t>
+      </w:r>
+    </w:p>
+    <w:p>
+      <w:pPr>
+        <w:rPr>
+          <w:rFonts w:asciiTheme="majorBidi" w:hAnsiTheme="majorBidi" w:cstheme="majorBidi"/>
+        </w:rPr>
+      </w:pPr>
+      <w:r>
+        <w:rPr>
+          <w:rFonts w:asciiTheme="majorBidi" w:hAnsiTheme="majorBidi" w:cstheme="majorBidi"/>
+        </w:rPr>
+        <w:t xml:space="preserve">  │ </w:t>
+      </w:r>
+      <w:proofErr w:type="spellStart"/>
+      <w:r>
+        <w:rPr>
+          <w:rFonts w:asciiTheme="majorBidi" w:hAnsiTheme="majorBidi" w:cstheme="majorBidi"/>
+        </w:rPr>
+        <w:t>ContactPerson</w:t>
+      </w:r>
+      <w:proofErr w:type="spellEnd"/>
+      <w:r>
+        <w:rPr>
+          <w:rFonts w:asciiTheme="majorBidi" w:hAnsiTheme="majorBidi" w:cstheme="majorBidi"/>
+        </w:rPr>
+        <w:t xml:space="preserve">         │                                                                                    │</w:t>
+      </w:r>
+    </w:p>
+    <w:p>
+      <w:pPr>
+        <w:rPr>
+          <w:rFonts w:asciiTheme="majorBidi" w:hAnsiTheme="majorBidi" w:cstheme="majorBidi"/>
+        </w:rPr>
+      </w:pPr>
+      <w:r>
+        <w:rPr>
+          <w:rFonts w:asciiTheme="majorBidi" w:hAnsiTheme="majorBidi" w:cstheme="majorBidi"/>
+        </w:rPr>
+        <w:t xml:space="preserve">  ├───────────────────────┼────────────────────────────────────────────────────────────────────────────────────┤</w:t>
+      </w:r>
+    </w:p>
+    <w:p>
+      <w:pPr>
+        <w:rPr>
+          <w:rFonts w:asciiTheme="majorBidi" w:hAnsiTheme="majorBidi" w:cstheme="majorBidi"/>
+        </w:rPr>
+      </w:pPr>
+      <w:r>
+        <w:rPr>
+          <w:rFonts w:asciiTheme="majorBidi" w:hAnsiTheme="majorBidi" w:cstheme="majorBidi"/>
+        </w:rPr>
+        <w:t xml:space="preserve">  │ </w:t>
+      </w:r>
+      <w:proofErr w:type="gramStart"/>
+      <w:r>
+        <w:rPr>
+          <w:rFonts w:asciiTheme="majorBidi" w:hAnsiTheme="majorBidi" w:cstheme="majorBidi"/>
+        </w:rPr>
+        <w:t>Hke::</w:t>
+      </w:r>
+      <w:proofErr w:type="spellStart"/>
+      <w:proofErr w:type="gramEnd"/>
+      <w:r>
+        <w:rPr>
+          <w:rFonts w:asciiTheme="majorBidi" w:hAnsiTheme="majorBidi" w:cstheme="majorBidi"/>
+        </w:rPr>
+        <w:t>ShortLink</w:t>
+      </w:r>
+      <w:proofErr w:type="spellEnd"/>
+      <w:r>
+        <w:rPr>
+          <w:rFonts w:asciiTheme="majorBidi" w:hAnsiTheme="majorBidi" w:cstheme="majorBidi"/>
+        </w:rPr>
+        <w:t xml:space="preserve">        │ Per-SMS short code → contact + </w:t>
+      </w:r>
+      <w:proofErr w:type="spellStart"/>
+      <w:r>
+        <w:rPr>
+          <w:rFonts w:asciiTheme="majorBidi" w:hAnsiTheme="majorBidi" w:cstheme="majorBidi"/>
+        </w:rPr>
+        <w:t>via_token</w:t>
+      </w:r>
+      <w:proofErr w:type="spellEnd"/>
+      <w:r>
+        <w:rPr>
+          <w:rFonts w:asciiTheme="majorBidi" w:hAnsiTheme="majorBidi" w:cstheme="majorBidi"/>
+        </w:rPr>
+        <w:t xml:space="preserve">                                           │</w:t>
+      </w:r>
+    </w:p>
+    <w:p>
+      <w:pPr>
+        <w:rPr>
+          <w:rFonts w:asciiTheme="majorBidi" w:hAnsiTheme="majorBidi" w:cstheme="majorBidi"/>
+        </w:rPr>
+      </w:pPr>
+      <w:r>
+        <w:rPr>
+          <w:rFonts w:asciiTheme="majorBidi" w:hAnsiTheme="majorBidi" w:cstheme="majorBidi"/>
+        </w:rPr>
+        <w:t xml:space="preserve">  ├───────────────────────┼────────────────────────────────────────────────────────────────────────────────────┤</w:t>
+      </w:r>
+    </w:p>
+    <w:p>
+      <w:pPr>
+        <w:rPr>
+          <w:rFonts w:asciiTheme="majorBidi" w:hAnsiTheme="majorBidi" w:cstheme="majorBidi"/>
+        </w:rPr>
+      </w:pPr>
+      <w:r>
+        <w:rPr>
+          <w:rFonts w:asciiTheme="majorBidi" w:hAnsiTheme="majorBidi" w:cstheme="majorBidi"/>
+        </w:rPr>
+        <w:t xml:space="preserve">  │ </w:t>
+      </w:r>
+      <w:proofErr w:type="gramStart"/>
+      <w:r>
+        <w:rPr>
+          <w:rFonts w:asciiTheme="majorBidi" w:hAnsiTheme="majorBidi" w:cstheme="majorBidi"/>
+        </w:rPr>
+        <w:t>Hke::</w:t>
+      </w:r>
+      <w:proofErr w:type="spellStart"/>
+      <w:proofErr w:type="gramEnd"/>
+      <w:r>
+        <w:rPr>
+          <w:rFonts w:asciiTheme="majorBidi" w:hAnsiTheme="majorBidi" w:cstheme="majorBidi"/>
+        </w:rPr>
+        <w:t>CommunityVenue</w:t>
+      </w:r>
+      <w:proofErr w:type="spellEnd"/>
+      <w:r>
+        <w:rPr>
+          <w:rFonts w:asciiTheme="majorBidi" w:hAnsiTheme="majorBidi" w:cstheme="majorBidi"/>
+        </w:rPr>
+        <w:t xml:space="preserve">   │ Community-configured venue offerings (type: kaddish/seudah/custom, title,          │</w:t>
+      </w:r>
+    </w:p>
+    <w:p>
+      <w:pPr>
+        <w:rPr>
+          <w:rFonts w:asciiTheme="majorBidi" w:hAnsiTheme="majorBidi" w:cstheme="majorBidi"/>
+        </w:rPr>
+      </w:pPr>
+      <w:r>
+        <w:rPr>
+          <w:rFonts w:asciiTheme="majorBidi" w:hAnsiTheme="majorBidi" w:cstheme="majorBidi"/>
+        </w:rPr>
+        <w:t xml:space="preserve">  │                       │ description, active)                                                               │</w:t>
+      </w:r>
+    </w:p>
+    <w:p>
+      <w:pPr>
+        <w:rPr>
+          <w:rFonts w:asciiTheme="majorBidi" w:hAnsiTheme="majorBidi" w:cstheme="majorBidi"/>
+        </w:rPr>
+      </w:pPr>
+      <w:r>
+        <w:rPr>
+          <w:rFonts w:asciiTheme="majorBidi" w:hAnsiTheme="majorBidi" w:cstheme="majorBidi"/>
+        </w:rPr>
+        <w:t xml:space="preserve">  ├───────────────────────┼────────────────────────────────────────────────────────────────────────────────────┤</w:t>
+      </w:r>
+    </w:p>
+    <w:p>
+      <w:pPr>
+        <w:rPr>
+          <w:rFonts w:asciiTheme="majorBidi" w:hAnsiTheme="majorBidi" w:cstheme="majorBidi"/>
+        </w:rPr>
+      </w:pPr>
+      <w:r>
+        <w:rPr>
+          <w:rFonts w:asciiTheme="majorBidi" w:hAnsiTheme="majorBidi" w:cstheme="majorBidi"/>
+        </w:rPr>
+        <w:t xml:space="preserve">  │ </w:t>
+      </w:r>
+      <w:proofErr w:type="gramStart"/>
+      <w:r>
+        <w:rPr>
+          <w:rFonts w:asciiTheme="majorBidi" w:hAnsiTheme="majorBidi" w:cstheme="majorBidi"/>
+        </w:rPr>
+        <w:t>Hke::</w:t>
+      </w:r>
+      <w:proofErr w:type="spellStart"/>
+      <w:proofErr w:type="gramEnd"/>
+      <w:r>
+        <w:rPr>
+          <w:rFonts w:asciiTheme="majorBidi" w:hAnsiTheme="majorBidi" w:cstheme="majorBidi"/>
+        </w:rPr>
+        <w:t>VenueRequest</w:t>
+      </w:r>
+      <w:proofErr w:type="spellEnd"/>
+      <w:r>
+        <w:rPr>
+          <w:rFonts w:asciiTheme="majorBidi" w:hAnsiTheme="majorBidi" w:cstheme="majorBidi"/>
+        </w:rPr>
+        <w:t xml:space="preserve">     │ Log of contact venue requests (</w:t>
+      </w:r>
+      <w:proofErr w:type="spellStart"/>
+      <w:r>
+        <w:rPr>
+          <w:rFonts w:asciiTheme="majorBidi" w:hAnsiTheme="majorBidi" w:cstheme="majorBidi"/>
+        </w:rPr>
+        <w:t>contact_person_id</w:t>
+      </w:r>
+      <w:proofErr w:type="spellEnd"/>
+      <w:r>
+        <w:rPr>
+          <w:rFonts w:asciiTheme="majorBidi" w:hAnsiTheme="majorBidi" w:cstheme="majorBidi"/>
+        </w:rPr>
+        <w:t xml:space="preserve">, </w:t>
+      </w:r>
+      <w:proofErr w:type="spellStart"/>
+      <w:r>
+        <w:rPr>
+          <w:rFonts w:asciiTheme="majorBidi" w:hAnsiTheme="majorBidi" w:cstheme="majorBidi"/>
+        </w:rPr>
+        <w:t>venue_id</w:t>
+      </w:r>
+      <w:proofErr w:type="spellEnd"/>
+      <w:r>
+        <w:rPr>
+          <w:rFonts w:asciiTheme="majorBidi" w:hAnsiTheme="majorBidi" w:cstheme="majorBidi"/>
+        </w:rPr>
+        <w:t xml:space="preserve">, </w:t>
+      </w:r>
+      <w:proofErr w:type="spellStart"/>
+      <w:r>
+        <w:rPr>
+          <w:rFonts w:asciiTheme="majorBidi" w:hAnsiTheme="majorBidi" w:cstheme="majorBidi"/>
+        </w:rPr>
+        <w:t>relation_id</w:t>
+      </w:r>
+      <w:proofErr w:type="spellEnd"/>
+      <w:r>
+        <w:rPr>
+          <w:rFonts w:asciiTheme="majorBidi" w:hAnsiTheme="majorBidi" w:cstheme="majorBidi"/>
+        </w:rPr>
+        <w:t>, status,   │</w:t>
+      </w:r>
+    </w:p>
+    <w:p>
+      <w:pPr>
+        <w:rPr>
+          <w:rFonts w:asciiTheme="majorBidi" w:hAnsiTheme="majorBidi" w:cstheme="majorBidi"/>
+        </w:rPr>
+      </w:pPr>
+      <w:r>
+        <w:rPr>
+          <w:rFonts w:asciiTheme="majorBidi" w:hAnsiTheme="majorBidi" w:cstheme="majorBidi"/>
+        </w:rPr>
+        <w:t xml:space="preserve">  │                       │ </w:t>
+      </w:r>
+      <w:proofErr w:type="spellStart"/>
+      <w:r>
+        <w:rPr>
+          <w:rFonts w:asciiTheme="majorBidi" w:hAnsiTheme="majorBidi" w:cstheme="majorBidi"/>
+        </w:rPr>
+        <w:t>sent_email_at</w:t>
+      </w:r>
+      <w:proofErr w:type="spellEnd"/>
+      <w:r>
+        <w:rPr>
+          <w:rFonts w:asciiTheme="majorBidi" w:hAnsiTheme="majorBidi" w:cstheme="majorBidi"/>
+        </w:rPr>
+        <w:t>)                                                                     │</w:t>
+      </w:r>
+    </w:p>
+    <w:p>
+      <w:pPr>
+        <w:rPr>
+          <w:rFonts w:asciiTheme="majorBidi" w:hAnsiTheme="majorBidi" w:cstheme="majorBidi"/>
+        </w:rPr>
+      </w:pPr>
+      <w:r>
+        <w:rPr>
+          <w:rFonts w:asciiTheme="majorBidi" w:hAnsiTheme="majorBidi" w:cstheme="majorBidi"/>
+        </w:rPr>
+        <w:t xml:space="preserve">  └───────────────────────┴────────────────────────────────────────────────────────────────────────────────────┘</w:t>
+      </w:r>
+    </w:p>
+    <w:p>
+      <w:pPr>
+        <w:rPr>
+          <w:rFonts w:asciiTheme="majorBidi" w:hAnsiTheme="majorBidi" w:cstheme="majorBidi"/>
+        </w:rPr>
+      </w:pPr>
+    </w:p>
+    <w:p>
+      <w:pPr>
+        <w:rPr>
+          <w:rFonts w:asciiTheme="majorBidi" w:hAnsiTheme="majorBidi" w:cstheme="majorBidi"/>
+        </w:rPr>
+      </w:pPr>
+      <w:r>
+        <w:rPr>
+          <w:rFonts w:asciiTheme="majorBidi" w:hAnsiTheme="majorBidi" w:cstheme="majorBidi"/>
+        </w:rPr>
+        <w:t xml:space="preserve">  New controllers (under a new </w:t>
+      </w:r>
+      <w:proofErr w:type="gramStart"/>
+      <w:r>
+        <w:rPr>
+          <w:rFonts w:asciiTheme="majorBidi" w:hAnsiTheme="majorBidi" w:cstheme="majorBidi"/>
+        </w:rPr>
+        <w:t>Hke::</w:t>
+      </w:r>
+      <w:proofErr w:type="gramEnd"/>
+      <w:r>
+        <w:rPr>
+          <w:rFonts w:asciiTheme="majorBidi" w:hAnsiTheme="majorBidi" w:cstheme="majorBidi"/>
+        </w:rPr>
+        <w:t>Portal namespace, token-auth only):</w:t>
+      </w:r>
+    </w:p>
+    <w:p>
+      <w:pPr>
+        <w:rPr>
+          <w:rFonts w:asciiTheme="majorBidi" w:hAnsiTheme="majorBidi" w:cstheme="majorBidi"/>
+        </w:rPr>
+      </w:pPr>
+    </w:p>
+    <w:p>
+      <w:pPr>
+        <w:rPr>
+          <w:rFonts w:asciiTheme="majorBidi" w:hAnsiTheme="majorBidi" w:cstheme="majorBidi"/>
+        </w:rPr>
+      </w:pPr>
+      <w:r>
+        <w:rPr>
+          <w:rFonts w:asciiTheme="majorBidi" w:hAnsiTheme="majorBidi" w:cstheme="majorBidi"/>
+        </w:rPr>
+        <w:lastRenderedPageBreak/>
+        <w:t xml:space="preserve">  ┌───────────────────────────────┬────────────────────────────────────────────────────────┐</w:t>
+      </w:r>
+    </w:p>
+    <w:p>
+      <w:pPr>
+        <w:rPr>
+          <w:rFonts w:asciiTheme="majorBidi" w:hAnsiTheme="majorBidi" w:cstheme="majorBidi"/>
+        </w:rPr>
+      </w:pPr>
+      <w:r>
+        <w:rPr>
+          <w:rFonts w:asciiTheme="majorBidi" w:hAnsiTheme="majorBidi" w:cstheme="majorBidi"/>
+        </w:rPr>
+        <w:t xml:space="preserve">  │          Controller           │                        Actions                         │</w:t>
+      </w:r>
+    </w:p>
+    <w:p>
+      <w:pPr>
+        <w:rPr>
+          <w:rFonts w:asciiTheme="majorBidi" w:hAnsiTheme="majorBidi" w:cstheme="majorBidi"/>
+        </w:rPr>
+      </w:pPr>
+      <w:r>
+        <w:rPr>
+          <w:rFonts w:asciiTheme="majorBidi" w:hAnsiTheme="majorBidi" w:cstheme="majorBidi"/>
+        </w:rPr>
+        <w:t xml:space="preserve">  ├───────────────────────────────┼────────────────────────────────────────────────────────┤</w:t>
+      </w:r>
+    </w:p>
+    <w:p>
+      <w:pPr>
+        <w:rPr>
+          <w:rFonts w:asciiTheme="majorBidi" w:hAnsiTheme="majorBidi" w:cstheme="majorBidi"/>
+        </w:rPr>
+      </w:pPr>
+      <w:r>
+        <w:rPr>
+          <w:rFonts w:asciiTheme="majorBidi" w:hAnsiTheme="majorBidi" w:cstheme="majorBidi"/>
+        </w:rPr>
+        <w:t xml:space="preserve">  │ </w:t>
+      </w:r>
+      <w:proofErr w:type="gramStart"/>
+      <w:r>
+        <w:rPr>
+          <w:rFonts w:asciiTheme="majorBidi" w:hAnsiTheme="majorBidi" w:cstheme="majorBidi"/>
+        </w:rPr>
+        <w:t>Portal::</w:t>
+      </w:r>
+      <w:proofErr w:type="spellStart"/>
+      <w:proofErr w:type="gramEnd"/>
+      <w:r>
+        <w:rPr>
+          <w:rFonts w:asciiTheme="majorBidi" w:hAnsiTheme="majorBidi" w:cstheme="majorBidi"/>
+        </w:rPr>
+        <w:t>AccessController</w:t>
+      </w:r>
+      <w:proofErr w:type="spellEnd"/>
+      <w:r>
+        <w:rPr>
+          <w:rFonts w:asciiTheme="majorBidi" w:hAnsiTheme="majorBidi" w:cstheme="majorBidi"/>
+        </w:rPr>
+        <w:t xml:space="preserve">      │ Entry point — validates token, sets session, redirects │</w:t>
+      </w:r>
+    </w:p>
+    <w:p>
+      <w:pPr>
+        <w:rPr>
+          <w:rFonts w:asciiTheme="majorBidi" w:hAnsiTheme="majorBidi" w:cstheme="majorBidi"/>
+        </w:rPr>
+      </w:pPr>
+      <w:r>
+        <w:rPr>
+          <w:rFonts w:asciiTheme="majorBidi" w:hAnsiTheme="majorBidi" w:cstheme="majorBidi"/>
+        </w:rPr>
+        <w:t xml:space="preserve">  ├───────────────────────────────┼────────────────────────────────────────────────────────┤</w:t>
+      </w:r>
+    </w:p>
+    <w:p>
+      <w:pPr>
+        <w:rPr>
+          <w:rFonts w:asciiTheme="majorBidi" w:hAnsiTheme="majorBidi" w:cstheme="majorBidi"/>
+        </w:rPr>
+      </w:pPr>
+      <w:r>
+        <w:rPr>
+          <w:rFonts w:asciiTheme="majorBidi" w:hAnsiTheme="majorBidi" w:cstheme="majorBidi"/>
+        </w:rPr>
+        <w:t xml:space="preserve">  │ </w:t>
+      </w:r>
+      <w:proofErr w:type="gramStart"/>
+      <w:r>
+        <w:rPr>
+          <w:rFonts w:asciiTheme="majorBidi" w:hAnsiTheme="majorBidi" w:cstheme="majorBidi"/>
+        </w:rPr>
+        <w:t>Portal::</w:t>
+      </w:r>
+      <w:proofErr w:type="gramEnd"/>
+      <w:r>
+        <w:rPr>
+          <w:rFonts w:asciiTheme="majorBidi" w:hAnsiTheme="majorBidi" w:cstheme="majorBidi"/>
+        </w:rPr>
+        <w:t>DashboardController   │ Overview: deceased people, upcoming/sent messages      │</w:t>
+      </w:r>
+    </w:p>
+    <w:p>
+      <w:pPr>
+        <w:rPr>
+          <w:rFonts w:asciiTheme="majorBidi" w:hAnsiTheme="majorBidi" w:cstheme="majorBidi"/>
+        </w:rPr>
+      </w:pPr>
+      <w:r>
+        <w:rPr>
+          <w:rFonts w:asciiTheme="majorBidi" w:hAnsiTheme="majorBidi" w:cstheme="majorBidi"/>
+        </w:rPr>
+        <w:t xml:space="preserve">  ├───────────────────────────────┼────────────────────────────────────────────────────────┤</w:t>
+      </w:r>
+    </w:p>
+    <w:p>
+      <w:pPr>
+        <w:rPr>
+          <w:rFonts w:asciiTheme="majorBidi" w:hAnsiTheme="majorBidi" w:cstheme="majorBidi"/>
+        </w:rPr>
+      </w:pPr>
+      <w:r>
+        <w:rPr>
+          <w:rFonts w:asciiTheme="majorBidi" w:hAnsiTheme="majorBidi" w:cstheme="majorBidi"/>
+        </w:rPr>
+        <w:t xml:space="preserve">  │ </w:t>
+      </w:r>
+      <w:proofErr w:type="gramStart"/>
+      <w:r>
+        <w:rPr>
+          <w:rFonts w:asciiTheme="majorBidi" w:hAnsiTheme="majorBidi" w:cstheme="majorBidi"/>
+        </w:rPr>
+        <w:t>Portal::</w:t>
+      </w:r>
+      <w:proofErr w:type="spellStart"/>
+      <w:proofErr w:type="gramEnd"/>
+      <w:r>
+        <w:rPr>
+          <w:rFonts w:asciiTheme="majorBidi" w:hAnsiTheme="majorBidi" w:cstheme="majorBidi"/>
+        </w:rPr>
+        <w:t>ProfileController</w:t>
+      </w:r>
+      <w:proofErr w:type="spellEnd"/>
+      <w:r>
+        <w:rPr>
+          <w:rFonts w:asciiTheme="majorBidi" w:hAnsiTheme="majorBidi" w:cstheme="majorBidi"/>
+        </w:rPr>
+        <w:t xml:space="preserve">     │ Edit phone/email → triggers rebuild                    │</w:t>
+      </w:r>
+    </w:p>
+    <w:p>
+      <w:pPr>
+        <w:rPr>
+          <w:rFonts w:asciiTheme="majorBidi" w:hAnsiTheme="majorBidi" w:cstheme="majorBidi"/>
+        </w:rPr>
+      </w:pPr>
+      <w:r>
+        <w:rPr>
+          <w:rFonts w:asciiTheme="majorBidi" w:hAnsiTheme="majorBidi" w:cstheme="majorBidi"/>
+        </w:rPr>
+        <w:t xml:space="preserve">  ├───────────────────────────────┼────────────────────────────────────────────────────────┤</w:t>
+      </w:r>
+    </w:p>
+    <w:p>
+      <w:pPr>
+        <w:rPr>
+          <w:rFonts w:asciiTheme="majorBidi" w:hAnsiTheme="majorBidi" w:cstheme="majorBidi"/>
+        </w:rPr>
+      </w:pPr>
+      <w:r>
+        <w:rPr>
+          <w:rFonts w:asciiTheme="majorBidi" w:hAnsiTheme="majorBidi" w:cstheme="majorBidi"/>
+        </w:rPr>
+        <w:t xml:space="preserve">  │ </w:t>
+      </w:r>
+      <w:proofErr w:type="gramStart"/>
+      <w:r>
+        <w:rPr>
+          <w:rFonts w:asciiTheme="majorBidi" w:hAnsiTheme="majorBidi" w:cstheme="majorBidi"/>
+        </w:rPr>
+        <w:t>Portal::</w:t>
+      </w:r>
+      <w:proofErr w:type="spellStart"/>
+      <w:proofErr w:type="gramEnd"/>
+      <w:r>
+        <w:rPr>
+          <w:rFonts w:asciiTheme="majorBidi" w:hAnsiTheme="majorBidi" w:cstheme="majorBidi"/>
+        </w:rPr>
+        <w:t>PreferencesController</w:t>
+      </w:r>
+      <w:proofErr w:type="spellEnd"/>
+      <w:r>
+        <w:rPr>
+          <w:rFonts w:asciiTheme="majorBidi" w:hAnsiTheme="majorBidi" w:cstheme="majorBidi"/>
+        </w:rPr>
+        <w:t xml:space="preserve"> │ Global opt-out, delivery method, days-before           │</w:t>
+      </w:r>
+    </w:p>
+    <w:p>
+      <w:pPr>
+        <w:rPr>
+          <w:rFonts w:asciiTheme="majorBidi" w:hAnsiTheme="majorBidi" w:cstheme="majorBidi"/>
+        </w:rPr>
+      </w:pPr>
+      <w:r>
+        <w:rPr>
+          <w:rFonts w:asciiTheme="majorBidi" w:hAnsiTheme="majorBidi" w:cstheme="majorBidi"/>
+        </w:rPr>
+        <w:t xml:space="preserve">  ├───────────────────────────────┼────────────────────────────────────────────────────────┤</w:t>
+      </w:r>
+    </w:p>
+    <w:p>
+      <w:pPr>
+        <w:rPr>
+          <w:rFonts w:asciiTheme="majorBidi" w:hAnsiTheme="majorBidi" w:cstheme="majorBidi"/>
+        </w:rPr>
+      </w:pPr>
+      <w:r>
+        <w:rPr>
+          <w:rFonts w:asciiTheme="majorBidi" w:hAnsiTheme="majorBidi" w:cstheme="majorBidi"/>
+        </w:rPr>
+        <w:t xml:space="preserve">  │ </w:t>
+      </w:r>
+      <w:proofErr w:type="gramStart"/>
+      <w:r>
+        <w:rPr>
+          <w:rFonts w:asciiTheme="majorBidi" w:hAnsiTheme="majorBidi" w:cstheme="majorBidi"/>
+        </w:rPr>
+        <w:t>Portal::</w:t>
+      </w:r>
+      <w:proofErr w:type="spellStart"/>
+      <w:proofErr w:type="gramEnd"/>
+      <w:r>
+        <w:rPr>
+          <w:rFonts w:asciiTheme="majorBidi" w:hAnsiTheme="majorBidi" w:cstheme="majorBidi"/>
+        </w:rPr>
+        <w:t>RelationsController</w:t>
+      </w:r>
+      <w:proofErr w:type="spellEnd"/>
+      <w:r>
+        <w:rPr>
+          <w:rFonts w:asciiTheme="majorBidi" w:hAnsiTheme="majorBidi" w:cstheme="majorBidi"/>
+        </w:rPr>
+        <w:t xml:space="preserve">   │ Per-relation </w:t>
+      </w:r>
+      <w:proofErr w:type="spellStart"/>
+      <w:r>
+        <w:rPr>
+          <w:rFonts w:asciiTheme="majorBidi" w:hAnsiTheme="majorBidi" w:cstheme="majorBidi"/>
+        </w:rPr>
+        <w:t>prefs</w:t>
+      </w:r>
+      <w:proofErr w:type="spellEnd"/>
+      <w:r>
+        <w:rPr>
+          <w:rFonts w:asciiTheme="majorBidi" w:hAnsiTheme="majorBidi" w:cstheme="majorBidi"/>
+        </w:rPr>
+        <w:t xml:space="preserve"> + opt-out                           │</w:t>
+      </w:r>
+    </w:p>
+    <w:p>
+      <w:pPr>
+        <w:rPr>
+          <w:rFonts w:asciiTheme="majorBidi" w:hAnsiTheme="majorBidi" w:cstheme="majorBidi"/>
+        </w:rPr>
+      </w:pPr>
+      <w:r>
+        <w:rPr>
+          <w:rFonts w:asciiTheme="majorBidi" w:hAnsiTheme="majorBidi" w:cstheme="majorBidi"/>
+        </w:rPr>
+        <w:t xml:space="preserve">  ├───────────────────────────────┼────────────────────────────────────────────────────────┤</w:t>
+      </w:r>
+    </w:p>
+    <w:p>
+      <w:pPr>
+        <w:rPr>
+          <w:rFonts w:asciiTheme="majorBidi" w:hAnsiTheme="majorBidi" w:cstheme="majorBidi"/>
+        </w:rPr>
+      </w:pPr>
+      <w:r>
+        <w:rPr>
+          <w:rFonts w:asciiTheme="majorBidi" w:hAnsiTheme="majorBidi" w:cstheme="majorBidi"/>
+        </w:rPr>
+        <w:t xml:space="preserve">  │ </w:t>
+      </w:r>
+      <w:proofErr w:type="gramStart"/>
+      <w:r>
+        <w:rPr>
+          <w:rFonts w:asciiTheme="majorBidi" w:hAnsiTheme="majorBidi" w:cstheme="majorBidi"/>
+        </w:rPr>
+        <w:t>Portal::</w:t>
+      </w:r>
+      <w:proofErr w:type="spellStart"/>
+      <w:proofErr w:type="gramEnd"/>
+      <w:r>
+        <w:rPr>
+          <w:rFonts w:asciiTheme="majorBidi" w:hAnsiTheme="majorBidi" w:cstheme="majorBidi"/>
+        </w:rPr>
+        <w:t>VenuesController</w:t>
+      </w:r>
+      <w:proofErr w:type="spellEnd"/>
+      <w:r>
+        <w:rPr>
+          <w:rFonts w:asciiTheme="majorBidi" w:hAnsiTheme="majorBidi" w:cstheme="majorBidi"/>
+        </w:rPr>
+        <w:t xml:space="preserve">      │ Browse venues, submit request                          │</w:t>
+      </w:r>
+    </w:p>
+    <w:p>
+      <w:pPr>
+        <w:rPr>
+          <w:rFonts w:asciiTheme="majorBidi" w:hAnsiTheme="majorBidi" w:cstheme="majorBidi"/>
+        </w:rPr>
+      </w:pPr>
+      <w:r>
+        <w:rPr>
+          <w:rFonts w:asciiTheme="majorBidi" w:hAnsiTheme="majorBidi" w:cstheme="majorBidi"/>
+        </w:rPr>
+        <w:t xml:space="preserve">  └───────────────────────────────┴────────────────────────────────────────────────────────┘</w:t>
+      </w:r>
+    </w:p>
+    <w:p>
+      <w:pPr>
+        <w:rPr>
+          <w:rFonts w:asciiTheme="majorBidi" w:hAnsiTheme="majorBidi" w:cstheme="majorBidi"/>
+        </w:rPr>
+      </w:pPr>
+    </w:p>
+    <w:p>
+      <w:pPr>
+        <w:rPr>
+          <w:rFonts w:asciiTheme="majorBidi" w:hAnsiTheme="majorBidi" w:cstheme="majorBidi"/>
+        </w:rPr>
+      </w:pPr>
+      <w:r>
+        <w:rPr>
+          <w:rFonts w:asciiTheme="majorBidi" w:hAnsiTheme="majorBidi" w:cstheme="majorBidi"/>
+        </w:rPr>
+        <w:t xml:space="preserve">  New routes:</w:t>
+      </w:r>
+    </w:p>
+    <w:p>
+      <w:pPr>
+        <w:rPr>
+          <w:rFonts w:asciiTheme="majorBidi" w:hAnsiTheme="majorBidi" w:cstheme="majorBidi"/>
+        </w:rPr>
+      </w:pPr>
+      <w:r>
+        <w:rPr>
+          <w:rFonts w:asciiTheme="majorBidi" w:hAnsiTheme="majorBidi" w:cstheme="majorBidi"/>
+        </w:rPr>
+        <w:t xml:space="preserve">  /go/:code                    → </w:t>
+      </w:r>
+      <w:proofErr w:type="spellStart"/>
+      <w:r>
+        <w:rPr>
+          <w:rFonts w:asciiTheme="majorBidi" w:hAnsiTheme="majorBidi" w:cstheme="majorBidi"/>
+        </w:rPr>
+        <w:t>ShortLinksController#redirect</w:t>
+      </w:r>
+      <w:proofErr w:type="spellEnd"/>
+      <w:r>
+        <w:rPr>
+          <w:rFonts w:asciiTheme="majorBidi" w:hAnsiTheme="majorBidi" w:cstheme="majorBidi"/>
+        </w:rPr>
+        <w:t xml:space="preserve"> (public)</w:t>
+      </w:r>
+    </w:p>
+    <w:p>
+      <w:pPr>
+        <w:rPr>
+          <w:rFonts w:asciiTheme="majorBidi" w:hAnsiTheme="majorBidi" w:cstheme="majorBidi"/>
+        </w:rPr>
+      </w:pPr>
+      <w:r>
+        <w:rPr>
+          <w:rFonts w:asciiTheme="majorBidi" w:hAnsiTheme="majorBidi" w:cstheme="majorBidi"/>
+        </w:rPr>
+        <w:t xml:space="preserve">  /portal/:token               → Portal entry</w:t>
+      </w:r>
+    </w:p>
+    <w:p>
+      <w:pPr>
+        <w:rPr>
+          <w:rFonts w:asciiTheme="majorBidi" w:hAnsiTheme="majorBidi" w:cstheme="majorBidi"/>
+        </w:rPr>
+      </w:pPr>
+      <w:r>
+        <w:rPr>
+          <w:rFonts w:asciiTheme="majorBidi" w:hAnsiTheme="majorBidi" w:cstheme="majorBidi"/>
+        </w:rPr>
+        <w:t xml:space="preserve">  /portal/:token/dashboard</w:t>
+      </w:r>
+    </w:p>
+    <w:p>
+      <w:pPr>
+        <w:rPr>
+          <w:rFonts w:asciiTheme="majorBidi" w:hAnsiTheme="majorBidi" w:cstheme="majorBidi"/>
+        </w:rPr>
+      </w:pPr>
+      <w:r>
+        <w:rPr>
+          <w:rFonts w:asciiTheme="majorBidi" w:hAnsiTheme="majorBidi" w:cstheme="majorBidi"/>
+        </w:rPr>
+        <w:t xml:space="preserve">  /portal/:token/profile</w:t>
+      </w:r>
+    </w:p>
+    <w:p>
+      <w:pPr>
+        <w:rPr>
+          <w:rFonts w:asciiTheme="majorBidi" w:hAnsiTheme="majorBidi" w:cstheme="majorBidi"/>
+        </w:rPr>
+      </w:pPr>
+      <w:r>
+        <w:rPr>
+          <w:rFonts w:asciiTheme="majorBidi" w:hAnsiTheme="majorBidi" w:cstheme="majorBidi"/>
+        </w:rPr>
+        <w:t xml:space="preserve">  /portal/:token/preferences</w:t>
+      </w:r>
+    </w:p>
+    <w:p>
+      <w:pPr>
+        <w:rPr>
+          <w:rFonts w:asciiTheme="majorBidi" w:hAnsiTheme="majorBidi" w:cstheme="majorBidi"/>
+        </w:rPr>
+      </w:pPr>
+      <w:r>
+        <w:rPr>
+          <w:rFonts w:asciiTheme="majorBidi" w:hAnsiTheme="majorBidi" w:cstheme="majorBidi"/>
+        </w:rPr>
+        <w:t xml:space="preserve">  /portal/:token/relations/:id/preferences</w:t>
+      </w:r>
+    </w:p>
+    <w:p>
+      <w:pPr>
+        <w:rPr>
+          <w:rFonts w:asciiTheme="majorBidi" w:hAnsiTheme="majorBidi" w:cstheme="majorBidi"/>
+        </w:rPr>
+      </w:pPr>
+      <w:r>
+        <w:rPr>
+          <w:rFonts w:asciiTheme="majorBidi" w:hAnsiTheme="majorBidi" w:cstheme="majorBidi"/>
+        </w:rPr>
+        <w:t xml:space="preserve">  /portal/:token/venues</w:t>
+      </w:r>
+    </w:p>
+    <w:p>
+      <w:pPr>
+        <w:rPr>
+          <w:rFonts w:asciiTheme="majorBidi" w:hAnsiTheme="majorBidi" w:cstheme="majorBidi"/>
+        </w:rPr>
+      </w:pPr>
+      <w:r>
+        <w:rPr>
+          <w:rFonts w:asciiTheme="majorBidi" w:hAnsiTheme="majorBidi" w:cstheme="majorBidi"/>
+        </w:rPr>
+        <w:t xml:space="preserve">  /portal/:token/venues/:id/request</w:t>
+      </w:r>
+    </w:p>
+    <w:p>
+      <w:pPr>
+        <w:rPr>
+          <w:rFonts w:asciiTheme="majorBidi" w:hAnsiTheme="majorBidi" w:cstheme="majorBidi"/>
+        </w:rPr>
+      </w:pPr>
+    </w:p>
+    <w:p>
+      <w:pPr>
+        <w:rPr>
+          <w:rFonts w:asciiTheme="majorBidi" w:hAnsiTheme="majorBidi" w:cstheme="majorBidi"/>
+        </w:rPr>
+      </w:pPr>
+      <w:r>
+        <w:rPr>
+          <w:rFonts w:asciiTheme="majorBidi" w:hAnsiTheme="majorBidi" w:cstheme="majorBidi"/>
+        </w:rPr>
+        <w:t xml:space="preserve">  SMS message change:</w:t>
+      </w:r>
+    </w:p>
+    <w:p>
+      <w:pPr>
+        <w:rPr>
+          <w:rFonts w:asciiTheme="majorBidi" w:hAnsiTheme="majorBidi" w:cstheme="majorBidi"/>
+        </w:rPr>
+      </w:pPr>
+      <w:r>
+        <w:rPr>
+          <w:rFonts w:asciiTheme="majorBidi" w:hAnsiTheme="majorBidi" w:cstheme="majorBidi"/>
+        </w:rPr>
+        <w:t xml:space="preserve">  The Liquid template gets a new variable {{</w:t>
+      </w:r>
+      <w:proofErr w:type="spellStart"/>
+      <w:r>
+        <w:rPr>
+          <w:rFonts w:asciiTheme="majorBidi" w:hAnsiTheme="majorBidi" w:cstheme="majorBidi"/>
+        </w:rPr>
+        <w:t>portal_url</w:t>
+      </w:r>
+      <w:proofErr w:type="spellEnd"/>
+      <w:r>
+        <w:rPr>
+          <w:rFonts w:asciiTheme="majorBidi" w:hAnsiTheme="majorBidi" w:cstheme="majorBidi"/>
+        </w:rPr>
+        <w:t>}} — a freshly generated short link injected at send time by</w:t>
+      </w:r>
+    </w:p>
+    <w:p>
+      <w:pPr>
+        <w:rPr>
+          <w:rFonts w:asciiTheme="majorBidi" w:hAnsiTheme="majorBidi" w:cstheme="majorBidi"/>
+        </w:rPr>
+      </w:pPr>
+      <w:r>
+        <w:rPr>
+          <w:rFonts w:asciiTheme="majorBidi" w:hAnsiTheme="majorBidi" w:cstheme="majorBidi"/>
+        </w:rPr>
+        <w:t xml:space="preserve">  </w:t>
+      </w:r>
+      <w:proofErr w:type="spellStart"/>
+      <w:r>
+        <w:rPr>
+          <w:rFonts w:asciiTheme="majorBidi" w:hAnsiTheme="majorBidi" w:cstheme="majorBidi"/>
+        </w:rPr>
+        <w:t>FutureMessageSendJob</w:t>
+      </w:r>
+      <w:proofErr w:type="spellEnd"/>
+      <w:r>
+        <w:rPr>
+          <w:rFonts w:asciiTheme="majorBidi" w:hAnsiTheme="majorBidi" w:cstheme="majorBidi"/>
+        </w:rPr>
+        <w:t>.</w:t>
+      </w:r>
+    </w:p>
+    <w:p>
+      <w:pPr>
+        <w:rPr>
+          <w:rFonts w:asciiTheme="majorBidi" w:hAnsiTheme="majorBidi" w:cstheme="majorBidi"/>
+        </w:rPr>
+      </w:pPr>
+    </w:p>
+    <w:p>
+      <w:pPr>
+        <w:rPr>
+          <w:rFonts w:asciiTheme="majorBidi" w:hAnsiTheme="majorBidi" w:cstheme="majorBidi"/>
+        </w:rPr>
+      </w:pPr>
+      <w:r>
+        <w:rPr>
+          <w:rFonts w:asciiTheme="majorBidi" w:hAnsiTheme="majorBidi" w:cstheme="majorBidi"/>
+        </w:rPr>
+        <w:t xml:space="preserve">  Venue request flow:</w:t>
+      </w:r>
+    </w:p>
+    <w:p>
+      <w:pPr>
+        <w:rPr>
+          <w:rFonts w:asciiTheme="majorBidi" w:hAnsiTheme="majorBidi" w:cstheme="majorBidi"/>
+        </w:rPr>
+      </w:pPr>
+      <w:r>
+        <w:rPr>
+          <w:rFonts w:asciiTheme="majorBidi" w:hAnsiTheme="majorBidi" w:cstheme="majorBidi"/>
+        </w:rPr>
+        <w:t xml:space="preserve">  1. Contact taps "Request Kaddish"</w:t>
+      </w:r>
+    </w:p>
+    <w:p>
+      <w:pPr>
+        <w:rPr>
+          <w:rFonts w:asciiTheme="majorBidi" w:hAnsiTheme="majorBidi" w:cstheme="majorBidi"/>
+        </w:rPr>
+      </w:pPr>
+      <w:r>
+        <w:rPr>
+          <w:rFonts w:asciiTheme="majorBidi" w:hAnsiTheme="majorBidi" w:cstheme="majorBidi"/>
+        </w:rPr>
+        <w:t xml:space="preserve">  2. Sees a details page (community-configured text + what to expect)</w:t>
+      </w:r>
+    </w:p>
+    <w:p>
+      <w:pPr>
+        <w:rPr>
+          <w:rFonts w:asciiTheme="majorBidi" w:hAnsiTheme="majorBidi" w:cstheme="majorBidi"/>
+        </w:rPr>
+      </w:pPr>
+      <w:r>
+        <w:rPr>
+          <w:rFonts w:asciiTheme="majorBidi" w:hAnsiTheme="majorBidi" w:cstheme="majorBidi"/>
+        </w:rPr>
+        <w:t xml:space="preserve">  3. Submits → creates </w:t>
+      </w:r>
+      <w:proofErr w:type="spellStart"/>
+      <w:r>
+        <w:rPr>
+          <w:rFonts w:asciiTheme="majorBidi" w:hAnsiTheme="majorBidi" w:cstheme="majorBidi"/>
+        </w:rPr>
+        <w:t>VenueRequest</w:t>
+      </w:r>
+      <w:proofErr w:type="spellEnd"/>
+      <w:r>
+        <w:rPr>
+          <w:rFonts w:asciiTheme="majorBidi" w:hAnsiTheme="majorBidi" w:cstheme="majorBidi"/>
+        </w:rPr>
+        <w:t xml:space="preserve"> record + fires an email to community admin</w:t>
+      </w:r>
+    </w:p>
+    <w:p>
+      <w:pPr>
+        <w:rPr>
+          <w:rFonts w:asciiTheme="majorBidi" w:hAnsiTheme="majorBidi" w:cstheme="majorBidi"/>
+        </w:rPr>
+      </w:pPr>
+      <w:r>
+        <w:rPr>
+          <w:rFonts w:asciiTheme="majorBidi" w:hAnsiTheme="majorBidi" w:cstheme="majorBidi"/>
+        </w:rPr>
+        <w:t xml:space="preserve">  4. Contact sees confirmation</w:t>
+      </w:r>
+    </w:p>
+    <w:p>
+      <w:pPr>
+        <w:rPr>
+          <w:rFonts w:asciiTheme="majorBidi" w:hAnsiTheme="majorBidi" w:cstheme="majorBidi"/>
+        </w:rPr>
+      </w:pPr>
+      <w:r>
+        <w:rPr>
+          <w:rFonts w:asciiTheme="majorBidi" w:hAnsiTheme="majorBidi" w:cstheme="majorBidi"/>
+        </w:rPr>
+        <w:lastRenderedPageBreak/>
+        <w:t xml:space="preserve">  5. Admin sees requests in their dashboard</w:t>
+      </w:r>
+    </w:p>
+    <w:p>
+      <w:pPr>
+        <w:rPr>
+          <w:rFonts w:asciiTheme="majorBidi" w:hAnsiTheme="majorBidi" w:cstheme="majorBidi"/>
+        </w:rPr>
+      </w:pPr>
+    </w:p>
+    <w:p>
+      <w:pPr>
+        <w:rPr>
+          <w:rFonts w:asciiTheme="majorBidi" w:hAnsiTheme="majorBidi" w:cstheme="majorBidi"/>
+        </w:rPr>
+      </w:pPr>
+      <w:r>
+        <w:rPr>
+          <w:rFonts w:asciiTheme="majorBidi" w:hAnsiTheme="majorBidi" w:cstheme="majorBidi"/>
+        </w:rPr>
+        <w:t xml:space="preserve">  ---</w:t>
+      </w:r>
+    </w:p>
+    <w:p>
+      <w:pPr>
+        <w:rPr>
+          <w:rFonts w:asciiTheme="majorBidi" w:hAnsiTheme="majorBidi" w:cstheme="majorBidi"/>
+        </w:rPr>
+      </w:pPr>
+      <w:r>
+        <w:rPr>
+          <w:rFonts w:asciiTheme="majorBidi" w:hAnsiTheme="majorBidi" w:cstheme="majorBidi"/>
+        </w:rPr>
+        <w:t xml:space="preserve">  Remaining open questions before we start:</w:t>
+      </w:r>
+    </w:p>
+    <w:p>
+      <w:pPr>
+        <w:rPr>
+          <w:rFonts w:asciiTheme="majorBidi" w:hAnsiTheme="majorBidi" w:cstheme="majorBidi"/>
+        </w:rPr>
+      </w:pPr>
+    </w:p>
+    <w:p>
+      <w:pPr>
+        <w:rPr>
+          <w:rFonts w:asciiTheme="majorBidi" w:hAnsiTheme="majorBidi" w:cstheme="majorBidi"/>
+        </w:rPr>
+      </w:pPr>
+      <w:r>
+        <w:rPr>
+          <w:rFonts w:asciiTheme="majorBidi" w:hAnsiTheme="majorBidi" w:cstheme="majorBidi"/>
+        </w:rPr>
+        <w:t xml:space="preserve">  1. Short domain — same domain (</w:t>
+      </w:r>
+      <w:proofErr w:type="spellStart"/>
+      <w:r>
+        <w:rPr>
+          <w:rFonts w:asciiTheme="majorBidi" w:hAnsiTheme="majorBidi" w:cstheme="majorBidi"/>
+        </w:rPr>
+        <w:t>hakhel.app</w:t>
+      </w:r>
+      <w:proofErr w:type="spellEnd"/>
+      <w:r>
+        <w:rPr>
+          <w:rFonts w:asciiTheme="majorBidi" w:hAnsiTheme="majorBidi" w:cstheme="majorBidi"/>
+        </w:rPr>
+        <w:t>/go/xxx) or a separate short one?</w:t>
+      </w:r>
+    </w:p>
+    <w:p>
+      <w:pPr>
+        <w:rPr>
+          <w:rFonts w:asciiTheme="majorBidi" w:hAnsiTheme="majorBidi" w:cstheme="majorBidi"/>
+        </w:rPr>
+      </w:pPr>
+      <w:r>
+        <w:rPr>
+          <w:rFonts w:asciiTheme="majorBidi" w:hAnsiTheme="majorBidi" w:cstheme="majorBidi"/>
+        </w:rPr>
+        <w:t xml:space="preserve">  2. Community venue setup — who configures what Kaddish/Seudah looks like per community? Is this a form in the</w:t>
+      </w:r>
+    </w:p>
+    <w:p>
+      <w:pPr>
+        <w:rPr>
+          <w:rFonts w:asciiTheme="majorBidi" w:hAnsiTheme="majorBidi" w:cstheme="majorBidi"/>
+        </w:rPr>
+      </w:pPr>
+      <w:r>
+        <w:rPr>
+          <w:rFonts w:asciiTheme="majorBidi" w:hAnsiTheme="majorBidi" w:cstheme="majorBidi"/>
+        </w:rPr>
+        <w:t xml:space="preserve">  admin area, or do you want to seed defaults?</w:t>
+      </w:r>
+    </w:p>
+    <w:p>
+      <w:pPr>
+        <w:rPr>
+          <w:rFonts w:asciiTheme="majorBidi" w:hAnsiTheme="majorBidi" w:cstheme="majorBidi"/>
+        </w:rPr>
+      </w:pPr>
+      <w:r>
+        <w:rPr>
+          <w:rFonts w:asciiTheme="majorBidi" w:hAnsiTheme="majorBidi" w:cstheme="majorBidi"/>
+        </w:rPr>
+        <w:t xml:space="preserve">  3. Days-before at contact level — does this override all their relations, or just serve as a default that</w:t>
+      </w:r>
+    </w:p>
+    <w:p>
+      <w:pPr>
+        <w:rPr>
+          <w:rFonts w:asciiTheme="majorBidi" w:hAnsiTheme="majorBidi" w:cstheme="majorBidi"/>
+        </w:rPr>
+      </w:pPr>
+      <w:r>
+        <w:rPr>
+          <w:rFonts w:asciiTheme="majorBidi" w:hAnsiTheme="majorBidi" w:cstheme="majorBidi"/>
+        </w:rPr>
+        <w:t xml:space="preserve">  relation-level </w:t>
+      </w:r>
+      <w:proofErr w:type="spellStart"/>
+      <w:r>
+        <w:rPr>
+          <w:rFonts w:asciiTheme="majorBidi" w:hAnsiTheme="majorBidi" w:cstheme="majorBidi"/>
+        </w:rPr>
+        <w:t>prefs</w:t>
+      </w:r>
+      <w:proofErr w:type="spellEnd"/>
+      <w:r>
+        <w:rPr>
+          <w:rFonts w:asciiTheme="majorBidi" w:hAnsiTheme="majorBidi" w:cstheme="majorBidi"/>
+        </w:rPr>
+        <w:t xml:space="preserve"> can override?</w:t>
+      </w:r>
+    </w:p>
+    <w:p>
+      <w:pPr>
+        <w:rPr>
+          <w:rFonts w:asciiTheme="majorBidi" w:hAnsiTheme="majorBidi" w:cstheme="majorBidi"/>
+        </w:rPr>
+      </w:pPr>
+      <w:r>
+        <w:rPr>
+          <w:rFonts w:asciiTheme="majorBidi" w:hAnsiTheme="majorBidi" w:cstheme="majorBidi"/>
+        </w:rPr>
+        <w:t xml:space="preserve">  4. Portal locale — follow the system locale, or let the contact pick their language?</w:t>
+      </w:r>
+    </w:p>
+    <w:p>
+      <w:pPr>
+        <w:rPr>
+          <w:rFonts w:asciiTheme="majorBidi" w:hAnsiTheme="majorBidi" w:cstheme="majorBidi"/>
+        </w:rPr>
+      </w:pPr>
+      <w:r>
+        <w:rPr>
+          <w:rFonts w:asciiTheme="majorBidi" w:hAnsiTheme="majorBidi" w:cstheme="majorBidi"/>
+        </w:rPr>
+        <w:t xml:space="preserve">  5. Venue request email — plain text to admin, or a formatted template?</w:t>
+      </w:r>
+    </w:p>
+    <w:p>
+      <w:pPr>
+        <w:rPr>
+          <w:rFonts w:asciiTheme="majorBidi" w:hAnsiTheme="majorBidi" w:cstheme="majorBidi"/>
+        </w:rPr>
+      </w:pPr>
+    </w:p>
+    <w:p>
+      <w:pPr>
+        <w:rPr>
+          <w:rFonts w:asciiTheme="majorBidi" w:hAnsiTheme="majorBidi" w:cstheme="majorBidi"/>
+        </w:rPr>
+      </w:pPr>
+      <w:r>
+        <w:rPr>
+          <w:rFonts w:asciiTheme="majorBidi" w:hAnsiTheme="majorBidi" w:cstheme="majorBidi"/>
+        </w:rPr>
+        <w:t>--------- me:</w:t>
+      </w:r>
+    </w:p>
+    <w:p>
+      <w:pPr>
+        <w:pStyle w:val="ListParagraph"/>
+        <w:numPr>
+          <w:ilvl w:val="0"/>
+          <w:numId w:val="9"/>
+        </w:numPr>
+        <w:rPr>
+          <w:rFonts w:asciiTheme="majorBidi" w:hAnsiTheme="majorBidi" w:cstheme="majorBidi"/>
+        </w:rPr>
+      </w:pPr>
+      <w:r>
+        <w:rPr>
+          <w:rFonts w:asciiTheme="majorBidi" w:hAnsiTheme="majorBidi" w:cstheme="majorBidi"/>
+        </w:rPr>
+        <w:t xml:space="preserve">I have a domain: hakhel.net. I can get </w:t>
+      </w:r>
+      <w:proofErr w:type="spellStart"/>
+      <w:r>
+        <w:rPr>
+          <w:rFonts w:asciiTheme="majorBidi" w:hAnsiTheme="majorBidi" w:cstheme="majorBidi"/>
+        </w:rPr>
+        <w:t>hakhel.app</w:t>
+      </w:r>
+      <w:proofErr w:type="spellEnd"/>
+      <w:r>
+        <w:rPr>
+          <w:rFonts w:asciiTheme="majorBidi" w:hAnsiTheme="majorBidi" w:cstheme="majorBidi"/>
+        </w:rPr>
+        <w:t xml:space="preserve"> too, do you think it is better?</w:t>
+      </w:r>
+    </w:p>
+    <w:p>
+      <w:pPr>
+        <w:pStyle w:val="ListParagraph"/>
+        <w:numPr>
+          <w:ilvl w:val="0"/>
+          <w:numId w:val="9"/>
+        </w:numPr>
+        <w:rPr>
+          <w:rFonts w:asciiTheme="majorBidi" w:hAnsiTheme="majorBidi" w:cstheme="majorBidi"/>
+        </w:rPr>
+      </w:pPr>
+      <w:r>
+        <w:rPr>
+          <w:rFonts w:asciiTheme="majorBidi" w:hAnsiTheme="majorBidi" w:cstheme="majorBidi"/>
+        </w:rPr>
+        <w:t xml:space="preserve">The community admin should fill a form, I think, for each venue. We’ll have an </w:t>
+      </w:r>
+      <w:proofErr w:type="spellStart"/>
+      <w:r>
+        <w:rPr>
+          <w:rFonts w:asciiTheme="majorBidi" w:hAnsiTheme="majorBidi" w:cstheme="majorBidi"/>
+        </w:rPr>
+        <w:t>hrml.erb</w:t>
+      </w:r>
+      <w:proofErr w:type="spellEnd"/>
+      <w:r>
+        <w:rPr>
+          <w:rFonts w:asciiTheme="majorBidi" w:hAnsiTheme="majorBidi" w:cstheme="majorBidi"/>
+        </w:rPr>
+        <w:t xml:space="preserve"> page which will have the text and to fill in the details. Do you think we should use liquid for that as well or is </w:t>
+      </w:r>
+      <w:proofErr w:type="spellStart"/>
+      <w:r>
+        <w:rPr>
+          <w:rFonts w:asciiTheme="majorBidi" w:hAnsiTheme="majorBidi" w:cstheme="majorBidi"/>
+        </w:rPr>
+        <w:t>erb</w:t>
+      </w:r>
+      <w:proofErr w:type="spellEnd"/>
+      <w:r>
+        <w:rPr>
+          <w:rFonts w:asciiTheme="majorBidi" w:hAnsiTheme="majorBidi" w:cstheme="majorBidi"/>
+        </w:rPr>
+        <w:t xml:space="preserve"> sufficient. </w:t>
+      </w:r>
+      <w:r>
+        <w:rPr>
+          <w:rFonts w:asciiTheme="majorBidi" w:hAnsiTheme="majorBidi" w:cstheme="majorBidi"/>
+        </w:rPr>
+        <w:t>Perhaps we’ll start with a default simple template, and I’ll get feedback on it.</w:t>
+      </w:r>
+    </w:p>
+    <w:p>
+      <w:pPr>
+        <w:pStyle w:val="ListParagraph"/>
+        <w:numPr>
+          <w:ilvl w:val="0"/>
+          <w:numId w:val="9"/>
+        </w:numPr>
+        <w:rPr>
+          <w:rFonts w:asciiTheme="majorBidi" w:hAnsiTheme="majorBidi" w:cstheme="majorBidi"/>
+        </w:rPr>
+      </w:pPr>
+      <w:r>
+        <w:rPr>
+          <w:rFonts w:asciiTheme="majorBidi" w:hAnsiTheme="majorBidi" w:cstheme="majorBidi"/>
+        </w:rPr>
+        <w:t>I think yes. It overrides all relations. At the relation level there can be an opt out for that relation.</w:t>
+      </w:r>
+    </w:p>
+    <w:p>
+      <w:pPr>
+        <w:pStyle w:val="ListParagraph"/>
+        <w:numPr>
+          <w:ilvl w:val="0"/>
+          <w:numId w:val="9"/>
+        </w:numPr>
+        <w:rPr>
+          <w:rFonts w:asciiTheme="majorBidi" w:hAnsiTheme="majorBidi" w:cstheme="majorBidi"/>
+        </w:rPr>
+      </w:pPr>
+      <w:r>
+        <w:rPr>
+          <w:rFonts w:asciiTheme="majorBidi" w:hAnsiTheme="majorBidi" w:cstheme="majorBidi"/>
+        </w:rPr>
+        <w:t>Good question. Let the contact pick their language. There are many English speakers in the community. But it may turn the system into a monster. At this early stage – what do you think?</w:t>
+      </w:r>
+    </w:p>
+    <w:p>
+      <w:pPr>
+        <w:pStyle w:val="ListParagraph"/>
+        <w:numPr>
+          <w:ilvl w:val="0"/>
+          <w:numId w:val="9"/>
+        </w:numPr>
+        <w:rPr>
+          <w:rFonts w:asciiTheme="majorBidi" w:hAnsiTheme="majorBidi" w:cstheme="majorBidi"/>
+        </w:rPr>
+      </w:pPr>
+      <w:r>
+        <w:rPr>
+          <w:rFonts w:asciiTheme="majorBidi" w:hAnsiTheme="majorBidi" w:cstheme="majorBidi"/>
+        </w:rPr>
+        <w:t>Let’s do plain text for now.</w:t>
+      </w:r>
+    </w:p>
+    <w:p>
+      <w:pPr>
+        <w:rPr>
+          <w:rFonts w:asciiTheme="majorBidi" w:hAnsiTheme="majorBidi" w:cstheme="majorBidi"/>
+        </w:rPr>
+      </w:pPr>
+    </w:p>
+    <w:p>
+      <w:pPr>
+        <w:rPr>
+          <w:rFonts w:asciiTheme="majorBidi" w:hAnsiTheme="majorBidi" w:cstheme="majorBidi"/>
+        </w:rPr>
+      </w:pPr>
     </w:p>
     <w:p>
       <w:pPr>
@@ -65,12 +3667,16 @@
           <w:ilvl w:val="0"/>
           <w:numId w:val="4"/>
         </w:numPr>
-      </w:pPr>
-      <w:r>
-        <w:rPr>
+        <w:rPr>
+          <w:rFonts w:asciiTheme="majorBidi" w:hAnsiTheme="majorBidi" w:cstheme="majorBidi"/>
+        </w:rPr>
+      </w:pPr>
+      <w:r>
+        <w:rPr>
+          <w:rFonts w:asciiTheme="majorBidi" w:hAnsiTheme="majorBidi" w:cstheme="majorBidi"/>
           <w:lang w:bidi="he-IL"/>
         </w:rPr>
-        <w:t>Contact self-service</w:t>
+        <w:t>Opt-out handling</w:t>
       </w:r>
     </w:p>
     <w:p>
@@ -80,18 +3686,16 @@
           <w:ilvl w:val="1"/>
           <w:numId w:val="4"/>
         </w:numPr>
-      </w:pPr>
-      <w:r>
-        <w:rPr>
+        <w:rPr>
+          <w:rFonts w:asciiTheme="majorBidi" w:hAnsiTheme="majorBidi" w:cstheme="majorBidi"/>
+        </w:rPr>
+      </w:pPr>
+      <w:r>
+        <w:rPr>
+          <w:rFonts w:asciiTheme="majorBidi" w:hAnsiTheme="majorBidi" w:cstheme="majorBidi"/>
           <w:lang w:bidi="he-IL"/>
         </w:rPr>
-        <w:t>Login via magic link (special token)</w:t>
-      </w:r>
-      <w:r>
-        <w:rPr>
-          <w:lang w:bidi="he-IL"/>
-        </w:rPr>
-        <w:t xml:space="preserve"> sent in SMS or email</w:t>
+        <w:t>Via preferences for contact or relation</w:t>
       </w:r>
     </w:p>
     <w:p>
@@ -101,21 +3705,16 @@
           <w:ilvl w:val="1"/>
           <w:numId w:val="4"/>
         </w:numPr>
-      </w:pPr>
-      <w:r>
-        <w:t>Can manage their info + deceased list and preferences (override on community/system) per relation</w:t>
-      </w:r>
-    </w:p>
-    <w:p>
-      <w:pPr>
-        <w:pStyle w:val="ListParagraph"/>
-        <w:numPr>
-          <w:ilvl w:val="1"/>
-          <w:numId w:val="4"/>
-        </w:numPr>
-      </w:pPr>
-      <w:r>
-        <w:t>Can view which messages they were sent and future ones</w:t>
+        <w:rPr>
+          <w:rFonts w:asciiTheme="majorBidi" w:hAnsiTheme="majorBidi" w:cstheme="majorBidi"/>
+        </w:rPr>
+      </w:pPr>
+      <w:r>
+        <w:rPr>
+          <w:rFonts w:asciiTheme="majorBidi" w:hAnsiTheme="majorBidi" w:cstheme="majorBidi"/>
+          <w:lang w:bidi="he-IL"/>
+        </w:rPr>
+        <w:t>Via Twilio STOP – callback into the app</w:t>
       </w:r>
     </w:p>
     <w:p>
@@ -125,42 +3724,15 @@
           <w:ilvl w:val="0"/>
           <w:numId w:val="4"/>
         </w:numPr>
-      </w:pPr>
-      <w:r>
-        <w:rPr>
-          <w:lang w:bidi="he-IL"/>
-        </w:rPr>
-        <w:t>Opt-out handling</w:t>
-      </w:r>
-    </w:p>
-    <w:p>
-      <w:pPr>
-        <w:pStyle w:val="ListParagraph"/>
-        <w:numPr>
-          <w:ilvl w:val="1"/>
-          <w:numId w:val="4"/>
-        </w:numPr>
-      </w:pPr>
-      <w:r>
-        <w:rPr>
-          <w:lang w:bidi="he-IL"/>
-        </w:rPr>
-        <w:t>Via preferences for contact or relation</w:t>
-      </w:r>
-    </w:p>
-    <w:p>
-      <w:pPr>
-        <w:pStyle w:val="ListParagraph"/>
-        <w:numPr>
-          <w:ilvl w:val="1"/>
-          <w:numId w:val="4"/>
-        </w:numPr>
-      </w:pPr>
-      <w:r>
-        <w:rPr>
-          <w:lang w:bidi="he-IL"/>
-        </w:rPr>
-        <w:t>Via Twilio STOP – callback into the app</w:t>
+        <w:rPr>
+          <w:rFonts w:asciiTheme="majorBidi" w:hAnsiTheme="majorBidi" w:cstheme="majorBidi"/>
+        </w:rPr>
+      </w:pPr>
+      <w:r>
+        <w:rPr>
+          <w:rFonts w:asciiTheme="majorBidi" w:hAnsiTheme="majorBidi" w:cstheme="majorBidi"/>
+        </w:rPr>
+        <w:t>Support email [future]</w:t>
       </w:r>
     </w:p>
     <w:p>
@@ -170,28 +3742,28 @@
           <w:ilvl w:val="0"/>
           <w:numId w:val="4"/>
         </w:numPr>
-      </w:pPr>
-      <w:r>
-        <w:t>Support email [future]</w:t>
-      </w:r>
-    </w:p>
-    <w:p>
-      <w:pPr>
-        <w:pStyle w:val="ListParagraph"/>
-        <w:numPr>
-          <w:ilvl w:val="0"/>
-          <w:numId w:val="4"/>
-        </w:numPr>
-      </w:pPr>
-      <w:r>
+        <w:rPr>
+          <w:rFonts w:asciiTheme="majorBidi" w:hAnsiTheme="majorBidi" w:cstheme="majorBidi"/>
+        </w:rPr>
+      </w:pPr>
+      <w:r>
+        <w:rPr>
+          <w:rFonts w:asciiTheme="majorBidi" w:hAnsiTheme="majorBidi" w:cstheme="majorBidi"/>
+        </w:rPr>
         <w:t xml:space="preserve">Support </w:t>
       </w:r>
       <w:proofErr w:type="spellStart"/>
       <w:r>
+        <w:rPr>
+          <w:rFonts w:asciiTheme="majorBidi" w:hAnsiTheme="majorBidi" w:cstheme="majorBidi"/>
+        </w:rPr>
         <w:t>Whatsapp</w:t>
       </w:r>
       <w:proofErr w:type="spellEnd"/>
       <w:r>
+        <w:rPr>
+          <w:rFonts w:asciiTheme="majorBidi" w:hAnsiTheme="majorBidi" w:cstheme="majorBidi"/>
+        </w:rPr>
         <w:t xml:space="preserve"> [future]</w:t>
       </w:r>
     </w:p>
@@ -299,7 +3871,7 @@
   <w:abstractNum w:abstractNumId="1" w15:restartNumberingAfterBreak="0">
     <w:nsid w:val="488715C0"/>
     <w:multiLevelType w:val="multilevel"/>
-    <w:tmpl w:val="0409001F"/>
+    <w:tmpl w:val="D8688784"/>
     <w:lvl w:ilvl="0">
       <w:start w:val="1"/>
       <w:numFmt w:val="decimal"/>
@@ -315,17 +3887,20 @@
       <w:lvlText w:val="%1.%2."/>
       <w:lvlJc w:val="left"/>
       <w:pPr>
-        <w:ind w:left="792" w:hanging="432"/>
+        <w:ind w:left="432" w:hanging="432"/>
       </w:pPr>
     </w:lvl>
     <w:lvl w:ilvl="2">
       <w:start w:val="1"/>
-      <w:numFmt w:val="decimal"/>
-      <w:lvlText w:val="%1.%2.%3."/>
-      <w:lvlJc w:val="left"/>
-      <w:pPr>
-        <w:ind w:left="1224" w:hanging="504"/>
-      </w:pPr>
+      <w:numFmt w:val="bullet"/>
+      <w:lvlText w:val=""/>
+      <w:lvlJc w:val="left"/>
+      <w:pPr>
+        <w:ind w:left="1068" w:hanging="360"/>
+      </w:pPr>
+      <w:rPr>
+        <w:rFonts w:ascii="Symbol" w:hAnsi="Symbol" w:hint="default"/>
+      </w:rPr>
     </w:lvl>
     <w:lvl w:ilvl="3">
       <w:start w:val="1"/>
@@ -383,6 +3958,95 @@
     </w:lvl>
   </w:abstractNum>
   <w:abstractNum w:abstractNumId="2" w15:restartNumberingAfterBreak="0">
+    <w:nsid w:val="48AE0B00"/>
+    <w:multiLevelType w:val="hybridMultilevel"/>
+    <w:tmpl w:val="E214ACFE"/>
+    <w:lvl w:ilvl="0" w:tplc="0409000F">
+      <w:start w:val="1"/>
+      <w:numFmt w:val="decimal"/>
+      <w:lvlText w:val="%1."/>
+      <w:lvlJc w:val="left"/>
+      <w:pPr>
+        <w:ind w:left="720" w:hanging="360"/>
+      </w:pPr>
+      <w:rPr>
+        <w:rFonts w:hint="default"/>
+      </w:rPr>
+    </w:lvl>
+    <w:lvl w:ilvl="1" w:tplc="04090019" w:tentative="1">
+      <w:start w:val="1"/>
+      <w:numFmt w:val="lowerLetter"/>
+      <w:lvlText w:val="%2."/>
+      <w:lvlJc w:val="left"/>
+      <w:pPr>
+        <w:ind w:left="1440" w:hanging="360"/>
+      </w:pPr>
+    </w:lvl>
+    <w:lvl w:ilvl="2" w:tplc="0409001B" w:tentative="1">
+      <w:start w:val="1"/>
+      <w:numFmt w:val="lowerRoman"/>
+      <w:lvlText w:val="%3."/>
+      <w:lvlJc w:val="right"/>
+      <w:pPr>
+        <w:ind w:left="2160" w:hanging="180"/>
+      </w:pPr>
+    </w:lvl>
+    <w:lvl w:ilvl="3" w:tplc="0409000F" w:tentative="1">
+      <w:start w:val="1"/>
+      <w:numFmt w:val="decimal"/>
+      <w:lvlText w:val="%4."/>
+      <w:lvlJc w:val="left"/>
+      <w:pPr>
+        <w:ind w:left="2880" w:hanging="360"/>
+      </w:pPr>
+    </w:lvl>
+    <w:lvl w:ilvl="4" w:tplc="04090019" w:tentative="1">
+      <w:start w:val="1"/>
+      <w:numFmt w:val="lowerLetter"/>
+      <w:lvlText w:val="%5."/>
+      <w:lvlJc w:val="left"/>
+      <w:pPr>
+        <w:ind w:left="3600" w:hanging="360"/>
+      </w:pPr>
+    </w:lvl>
+    <w:lvl w:ilvl="5" w:tplc="0409001B" w:tentative="1">
+      <w:start w:val="1"/>
+      <w:numFmt w:val="lowerRoman"/>
+      <w:lvlText w:val="%6."/>
+      <w:lvlJc w:val="right"/>
+      <w:pPr>
+        <w:ind w:left="4320" w:hanging="180"/>
+      </w:pPr>
+    </w:lvl>
+    <w:lvl w:ilvl="6" w:tplc="0409000F" w:tentative="1">
+      <w:start w:val="1"/>
+      <w:numFmt w:val="decimal"/>
+      <w:lvlText w:val="%7."/>
+      <w:lvlJc w:val="left"/>
+      <w:pPr>
+        <w:ind w:left="5040" w:hanging="360"/>
+      </w:pPr>
+    </w:lvl>
+    <w:lvl w:ilvl="7" w:tplc="04090019" w:tentative="1">
+      <w:start w:val="1"/>
+      <w:numFmt w:val="lowerLetter"/>
+      <w:lvlText w:val="%8."/>
+      <w:lvlJc w:val="left"/>
+      <w:pPr>
+        <w:ind w:left="5760" w:hanging="360"/>
+      </w:pPr>
+    </w:lvl>
+    <w:lvl w:ilvl="8" w:tplc="0409001B" w:tentative="1">
+      <w:start w:val="1"/>
+      <w:numFmt w:val="lowerRoman"/>
+      <w:lvlText w:val="%9."/>
+      <w:lvlJc w:val="right"/>
+      <w:pPr>
+        <w:ind w:left="6480" w:hanging="180"/>
+      </w:pPr>
+    </w:lvl>
+  </w:abstractNum>
+  <w:abstractNum w:abstractNumId="3" w15:restartNumberingAfterBreak="0">
     <w:nsid w:val="4D8F323E"/>
     <w:multiLevelType w:val="hybridMultilevel"/>
     <w:tmpl w:val="723E2070"/>
@@ -468,7 +4132,99 @@
       </w:pPr>
     </w:lvl>
   </w:abstractNum>
-  <w:abstractNum w:abstractNumId="3" w15:restartNumberingAfterBreak="0">
+  <w:abstractNum w:abstractNumId="4" w15:restartNumberingAfterBreak="0">
+    <w:nsid w:val="67852D60"/>
+    <w:multiLevelType w:val="multilevel"/>
+    <w:tmpl w:val="E5580C68"/>
+    <w:lvl w:ilvl="0">
+      <w:start w:val="1"/>
+      <w:numFmt w:val="decimal"/>
+      <w:lvlText w:val="%1."/>
+      <w:lvlJc w:val="left"/>
+      <w:pPr>
+        <w:ind w:left="360" w:hanging="360"/>
+      </w:pPr>
+    </w:lvl>
+    <w:lvl w:ilvl="1">
+      <w:start w:val="1"/>
+      <w:numFmt w:val="bullet"/>
+      <w:lvlText w:val=""/>
+      <w:lvlJc w:val="left"/>
+      <w:pPr>
+        <w:ind w:left="360" w:hanging="360"/>
+      </w:pPr>
+      <w:rPr>
+        <w:rFonts w:ascii="Symbol" w:hAnsi="Symbol" w:hint="default"/>
+      </w:rPr>
+    </w:lvl>
+    <w:lvl w:ilvl="2">
+      <w:start w:val="1"/>
+      <w:numFmt w:val="bullet"/>
+      <w:lvlText w:val=""/>
+      <w:lvlJc w:val="left"/>
+      <w:pPr>
+        <w:ind w:left="1068" w:hanging="360"/>
+      </w:pPr>
+      <w:rPr>
+        <w:rFonts w:ascii="Symbol" w:hAnsi="Symbol" w:hint="default"/>
+      </w:rPr>
+    </w:lvl>
+    <w:lvl w:ilvl="3">
+      <w:start w:val="1"/>
+      <w:numFmt w:val="decimal"/>
+      <w:lvlText w:val="%1.%2.%3.%4."/>
+      <w:lvlJc w:val="left"/>
+      <w:pPr>
+        <w:ind w:left="1728" w:hanging="648"/>
+      </w:pPr>
+    </w:lvl>
+    <w:lvl w:ilvl="4">
+      <w:start w:val="1"/>
+      <w:numFmt w:val="decimal"/>
+      <w:lvlText w:val="%1.%2.%3.%4.%5."/>
+      <w:lvlJc w:val="left"/>
+      <w:pPr>
+        <w:ind w:left="2232" w:hanging="792"/>
+      </w:pPr>
+    </w:lvl>
+    <w:lvl w:ilvl="5">
+      <w:start w:val="1"/>
+      <w:numFmt w:val="decimal"/>
+      <w:lvlText w:val="%1.%2.%3.%4.%5.%6."/>
+      <w:lvlJc w:val="left"/>
+      <w:pPr>
+        <w:ind w:left="2736" w:hanging="936"/>
+      </w:pPr>
+    </w:lvl>
+    <w:lvl w:ilvl="6">
+      <w:start w:val="1"/>
+      <w:numFmt w:val="decimal"/>
+      <w:lvlText w:val="%1.%2.%3.%4.%5.%6.%7."/>
+      <w:lvlJc w:val="left"/>
+      <w:pPr>
+        <w:ind w:left="3240" w:hanging="1080"/>
+      </w:pPr>
+    </w:lvl>
+    <w:lvl w:ilvl="7">
+      <w:start w:val="1"/>
+      <w:numFmt w:val="decimal"/>
+      <w:lvlText w:val="%1.%2.%3.%4.%5.%6.%7.%8."/>
+      <w:lvlJc w:val="left"/>
+      <w:pPr>
+        <w:ind w:left="3744" w:hanging="1224"/>
+      </w:pPr>
+    </w:lvl>
+    <w:lvl w:ilvl="8">
+      <w:start w:val="1"/>
+      <w:numFmt w:val="decimal"/>
+      <w:lvlText w:val="%1.%2.%3.%4.%5.%6.%7.%8.%9."/>
+      <w:lvlJc w:val="left"/>
+      <w:pPr>
+        <w:ind w:left="4320" w:hanging="1440"/>
+      </w:pPr>
+    </w:lvl>
+  </w:abstractNum>
+  <w:abstractNum w:abstractNumId="5" w15:restartNumberingAfterBreak="0">
     <w:nsid w:val="6FED3894"/>
     <w:multiLevelType w:val="hybridMultilevel"/>
     <w:tmpl w:val="A2F06F1C"/>
@@ -554,17 +4310,299 @@
       </w:pPr>
     </w:lvl>
   </w:abstractNum>
+  <w:abstractNum w:abstractNumId="6" w15:restartNumberingAfterBreak="0">
+    <w:nsid w:val="72DF329C"/>
+    <w:multiLevelType w:val="hybridMultilevel"/>
+    <w:tmpl w:val="ED50AD24"/>
+    <w:lvl w:ilvl="0" w:tplc="0409000F">
+      <w:start w:val="1"/>
+      <w:numFmt w:val="decimal"/>
+      <w:lvlText w:val="%1."/>
+      <w:lvlJc w:val="left"/>
+      <w:pPr>
+        <w:ind w:left="720" w:hanging="360"/>
+      </w:pPr>
+      <w:rPr>
+        <w:rFonts w:hint="default"/>
+      </w:rPr>
+    </w:lvl>
+    <w:lvl w:ilvl="1" w:tplc="04090019" w:tentative="1">
+      <w:start w:val="1"/>
+      <w:numFmt w:val="lowerLetter"/>
+      <w:lvlText w:val="%2."/>
+      <w:lvlJc w:val="left"/>
+      <w:pPr>
+        <w:ind w:left="1440" w:hanging="360"/>
+      </w:pPr>
+    </w:lvl>
+    <w:lvl w:ilvl="2" w:tplc="0409001B" w:tentative="1">
+      <w:start w:val="1"/>
+      <w:numFmt w:val="lowerRoman"/>
+      <w:lvlText w:val="%3."/>
+      <w:lvlJc w:val="right"/>
+      <w:pPr>
+        <w:ind w:left="2160" w:hanging="180"/>
+      </w:pPr>
+    </w:lvl>
+    <w:lvl w:ilvl="3" w:tplc="0409000F" w:tentative="1">
+      <w:start w:val="1"/>
+      <w:numFmt w:val="decimal"/>
+      <w:lvlText w:val="%4."/>
+      <w:lvlJc w:val="left"/>
+      <w:pPr>
+        <w:ind w:left="2880" w:hanging="360"/>
+      </w:pPr>
+    </w:lvl>
+    <w:lvl w:ilvl="4" w:tplc="04090019" w:tentative="1">
+      <w:start w:val="1"/>
+      <w:numFmt w:val="lowerLetter"/>
+      <w:lvlText w:val="%5."/>
+      <w:lvlJc w:val="left"/>
+      <w:pPr>
+        <w:ind w:left="3600" w:hanging="360"/>
+      </w:pPr>
+    </w:lvl>
+    <w:lvl w:ilvl="5" w:tplc="0409001B" w:tentative="1">
+      <w:start w:val="1"/>
+      <w:numFmt w:val="lowerRoman"/>
+      <w:lvlText w:val="%6."/>
+      <w:lvlJc w:val="right"/>
+      <w:pPr>
+        <w:ind w:left="4320" w:hanging="180"/>
+      </w:pPr>
+    </w:lvl>
+    <w:lvl w:ilvl="6" w:tplc="0409000F" w:tentative="1">
+      <w:start w:val="1"/>
+      <w:numFmt w:val="decimal"/>
+      <w:lvlText w:val="%7."/>
+      <w:lvlJc w:val="left"/>
+      <w:pPr>
+        <w:ind w:left="5040" w:hanging="360"/>
+      </w:pPr>
+    </w:lvl>
+    <w:lvl w:ilvl="7" w:tplc="04090019" w:tentative="1">
+      <w:start w:val="1"/>
+      <w:numFmt w:val="lowerLetter"/>
+      <w:lvlText w:val="%8."/>
+      <w:lvlJc w:val="left"/>
+      <w:pPr>
+        <w:ind w:left="5760" w:hanging="360"/>
+      </w:pPr>
+    </w:lvl>
+    <w:lvl w:ilvl="8" w:tplc="0409001B" w:tentative="1">
+      <w:start w:val="1"/>
+      <w:numFmt w:val="lowerRoman"/>
+      <w:lvlText w:val="%9."/>
+      <w:lvlJc w:val="right"/>
+      <w:pPr>
+        <w:ind w:left="6480" w:hanging="180"/>
+      </w:pPr>
+    </w:lvl>
+  </w:abstractNum>
+  <w:abstractNum w:abstractNumId="7" w15:restartNumberingAfterBreak="0">
+    <w:nsid w:val="77967A09"/>
+    <w:multiLevelType w:val="hybridMultilevel"/>
+    <w:tmpl w:val="55F03BE6"/>
+    <w:lvl w:ilvl="0" w:tplc="0409000F">
+      <w:start w:val="1"/>
+      <w:numFmt w:val="decimal"/>
+      <w:lvlText w:val="%1."/>
+      <w:lvlJc w:val="left"/>
+      <w:pPr>
+        <w:ind w:left="720" w:hanging="360"/>
+      </w:pPr>
+      <w:rPr>
+        <w:rFonts w:hint="default"/>
+      </w:rPr>
+    </w:lvl>
+    <w:lvl w:ilvl="1" w:tplc="04090019">
+      <w:start w:val="1"/>
+      <w:numFmt w:val="lowerLetter"/>
+      <w:lvlText w:val="%2."/>
+      <w:lvlJc w:val="left"/>
+      <w:pPr>
+        <w:ind w:left="1440" w:hanging="360"/>
+      </w:pPr>
+    </w:lvl>
+    <w:lvl w:ilvl="2" w:tplc="0409001B" w:tentative="1">
+      <w:start w:val="1"/>
+      <w:numFmt w:val="lowerRoman"/>
+      <w:lvlText w:val="%3."/>
+      <w:lvlJc w:val="right"/>
+      <w:pPr>
+        <w:ind w:left="2160" w:hanging="180"/>
+      </w:pPr>
+    </w:lvl>
+    <w:lvl w:ilvl="3" w:tplc="0409000F" w:tentative="1">
+      <w:start w:val="1"/>
+      <w:numFmt w:val="decimal"/>
+      <w:lvlText w:val="%4."/>
+      <w:lvlJc w:val="left"/>
+      <w:pPr>
+        <w:ind w:left="2880" w:hanging="360"/>
+      </w:pPr>
+    </w:lvl>
+    <w:lvl w:ilvl="4" w:tplc="04090019" w:tentative="1">
+      <w:start w:val="1"/>
+      <w:numFmt w:val="lowerLetter"/>
+      <w:lvlText w:val="%5."/>
+      <w:lvlJc w:val="left"/>
+      <w:pPr>
+        <w:ind w:left="3600" w:hanging="360"/>
+      </w:pPr>
+    </w:lvl>
+    <w:lvl w:ilvl="5" w:tplc="0409001B" w:tentative="1">
+      <w:start w:val="1"/>
+      <w:numFmt w:val="lowerRoman"/>
+      <w:lvlText w:val="%6."/>
+      <w:lvlJc w:val="right"/>
+      <w:pPr>
+        <w:ind w:left="4320" w:hanging="180"/>
+      </w:pPr>
+    </w:lvl>
+    <w:lvl w:ilvl="6" w:tplc="0409000F" w:tentative="1">
+      <w:start w:val="1"/>
+      <w:numFmt w:val="decimal"/>
+      <w:lvlText w:val="%7."/>
+      <w:lvlJc w:val="left"/>
+      <w:pPr>
+        <w:ind w:left="5040" w:hanging="360"/>
+      </w:pPr>
+    </w:lvl>
+    <w:lvl w:ilvl="7" w:tplc="04090019" w:tentative="1">
+      <w:start w:val="1"/>
+      <w:numFmt w:val="lowerLetter"/>
+      <w:lvlText w:val="%8."/>
+      <w:lvlJc w:val="left"/>
+      <w:pPr>
+        <w:ind w:left="5760" w:hanging="360"/>
+      </w:pPr>
+    </w:lvl>
+    <w:lvl w:ilvl="8" w:tplc="0409001B" w:tentative="1">
+      <w:start w:val="1"/>
+      <w:numFmt w:val="lowerRoman"/>
+      <w:lvlText w:val="%9."/>
+      <w:lvlJc w:val="right"/>
+      <w:pPr>
+        <w:ind w:left="6480" w:hanging="180"/>
+      </w:pPr>
+    </w:lvl>
+  </w:abstractNum>
+  <w:abstractNum w:abstractNumId="8" w15:restartNumberingAfterBreak="0">
+    <w:nsid w:val="7C843858"/>
+    <w:multiLevelType w:val="multilevel"/>
+    <w:tmpl w:val="D8688784"/>
+    <w:lvl w:ilvl="0">
+      <w:start w:val="1"/>
+      <w:numFmt w:val="decimal"/>
+      <w:lvlText w:val="%1."/>
+      <w:lvlJc w:val="left"/>
+      <w:pPr>
+        <w:ind w:left="360" w:hanging="360"/>
+      </w:pPr>
+    </w:lvl>
+    <w:lvl w:ilvl="1">
+      <w:start w:val="1"/>
+      <w:numFmt w:val="decimal"/>
+      <w:lvlText w:val="%1.%2."/>
+      <w:lvlJc w:val="left"/>
+      <w:pPr>
+        <w:ind w:left="432" w:hanging="432"/>
+      </w:pPr>
+    </w:lvl>
+    <w:lvl w:ilvl="2">
+      <w:start w:val="1"/>
+      <w:numFmt w:val="bullet"/>
+      <w:lvlText w:val=""/>
+      <w:lvlJc w:val="left"/>
+      <w:pPr>
+        <w:ind w:left="1068" w:hanging="360"/>
+      </w:pPr>
+      <w:rPr>
+        <w:rFonts w:ascii="Symbol" w:hAnsi="Symbol" w:hint="default"/>
+      </w:rPr>
+    </w:lvl>
+    <w:lvl w:ilvl="3">
+      <w:start w:val="1"/>
+      <w:numFmt w:val="decimal"/>
+      <w:lvlText w:val="%1.%2.%3.%4."/>
+      <w:lvlJc w:val="left"/>
+      <w:pPr>
+        <w:ind w:left="1728" w:hanging="648"/>
+      </w:pPr>
+    </w:lvl>
+    <w:lvl w:ilvl="4">
+      <w:start w:val="1"/>
+      <w:numFmt w:val="decimal"/>
+      <w:lvlText w:val="%1.%2.%3.%4.%5."/>
+      <w:lvlJc w:val="left"/>
+      <w:pPr>
+        <w:ind w:left="2232" w:hanging="792"/>
+      </w:pPr>
+    </w:lvl>
+    <w:lvl w:ilvl="5">
+      <w:start w:val="1"/>
+      <w:numFmt w:val="decimal"/>
+      <w:lvlText w:val="%1.%2.%3.%4.%5.%6."/>
+      <w:lvlJc w:val="left"/>
+      <w:pPr>
+        <w:ind w:left="2736" w:hanging="936"/>
+      </w:pPr>
+    </w:lvl>
+    <w:lvl w:ilvl="6">
+      <w:start w:val="1"/>
+      <w:numFmt w:val="decimal"/>
+      <w:lvlText w:val="%1.%2.%3.%4.%5.%6.%7."/>
+      <w:lvlJc w:val="left"/>
+      <w:pPr>
+        <w:ind w:left="3240" w:hanging="1080"/>
+      </w:pPr>
+    </w:lvl>
+    <w:lvl w:ilvl="7">
+      <w:start w:val="1"/>
+      <w:numFmt w:val="decimal"/>
+      <w:lvlText w:val="%1.%2.%3.%4.%5.%6.%7.%8."/>
+      <w:lvlJc w:val="left"/>
+      <w:pPr>
+        <w:ind w:left="3744" w:hanging="1224"/>
+      </w:pPr>
+    </w:lvl>
+    <w:lvl w:ilvl="8">
+      <w:start w:val="1"/>
+      <w:numFmt w:val="decimal"/>
+      <w:lvlText w:val="%1.%2.%3.%4.%5.%6.%7.%8.%9."/>
+      <w:lvlJc w:val="left"/>
+      <w:pPr>
+        <w:ind w:left="4320" w:hanging="1440"/>
+      </w:pPr>
+    </w:lvl>
+  </w:abstractNum>
   <w:num w:numId="1" w16cid:durableId="1290629152">
-    <w:abstractNumId w:val="2"/>
+    <w:abstractNumId w:val="3"/>
   </w:num>
   <w:num w:numId="2" w16cid:durableId="594362306">
     <w:abstractNumId w:val="0"/>
   </w:num>
   <w:num w:numId="3" w16cid:durableId="1820269008">
-    <w:abstractNumId w:val="3"/>
+    <w:abstractNumId w:val="5"/>
   </w:num>
   <w:num w:numId="4" w16cid:durableId="1361200711">
     <w:abstractNumId w:val="1"/>
+  </w:num>
+  <w:num w:numId="5" w16cid:durableId="1684356159">
+    <w:abstractNumId w:val="8"/>
+  </w:num>
+  <w:num w:numId="6" w16cid:durableId="27754313">
+    <w:abstractNumId w:val="4"/>
+  </w:num>
+  <w:num w:numId="7" w16cid:durableId="323356796">
+    <w:abstractNumId w:val="7"/>
+  </w:num>
+  <w:num w:numId="8" w16cid:durableId="639264243">
+    <w:abstractNumId w:val="2"/>
+  </w:num>
+  <w:num w:numId="9" w16cid:durableId="574323102">
+    <w:abstractNumId w:val="6"/>
   </w:num>
 </w:numbering>
 </file>

</xml_diff>